<commit_message>
fix: issue display and generation:
- The display interface becomes scrollable when the issue is too long;
- Issues can be exported by default even if not confirmed;
- Multiple issue can be exported into a single DOCX file.
</commit_message>
<xml_diff>
--- a/templates/问题单模板.docx
+++ b/templates/问题单模板.docx
@@ -1069,18 +1069,18 @@
       </w:r>
       <w:r>
         <w:rPr>
-          <w:rFonts w:ascii="Arial" w:eastAsia="Arial" w:hAnsi="Arial" w:cs="Arial"/>
+          <w:rFonts w:ascii="Arial" w:eastAsiaTheme="minorEastAsia" w:hAnsi="Arial" w:cs="Arial"/>
         </w:rPr>
-        <w:t>1</w:t>
+        <w:t>CURRENT</w:t>
       </w:r>
       <w:r>
         <w:t>页，共</w:t>
       </w:r>
       <w:r>
         <w:rPr>
-          <w:rFonts w:ascii="Arial" w:eastAsia="Arial" w:hAnsi="Arial" w:cs="Arial"/>
+          <w:rFonts w:ascii="Arial" w:eastAsiaTheme="minorEastAsia" w:hAnsi="Arial" w:cs="Arial"/>
         </w:rPr>
-        <w:t>9</w:t>
+        <w:t>TOTAL</w:t>
       </w:r>
       <w:r>
         <w:t>页</w:t>

</xml_diff>

<commit_message>
feat: update project statistics display and enhance alignment issue highlighting
</commit_message>
<xml_diff>
--- a/templates/问题单模板.docx
+++ b/templates/问题单模板.docx
@@ -1,10 +1,10 @@
 
 <file path=word/document.xml><?xml version="1.0" encoding="utf-8"?>
-<w:document xmlns:wpc="http://schemas.microsoft.com/office/word/2010/wordprocessingCanvas" xmlns:cx="http://schemas.microsoft.com/office/drawing/2014/chartex" xmlns:mc="http://schemas.openxmlformats.org/markup-compatibility/2006" xmlns:o="urn:schemas-microsoft-com:office:office" xmlns:r="http://schemas.openxmlformats.org/officeDocument/2006/relationships" xmlns:m="http://schemas.openxmlformats.org/officeDocument/2006/math" xmlns:v="urn:schemas-microsoft-com:vml" xmlns:wp14="http://schemas.microsoft.com/office/word/2010/wordprocessingDrawing" xmlns:wp="http://schemas.openxmlformats.org/drawingml/2006/wordprocessingDrawing" xmlns:w10="urn:schemas-microsoft-com:office:word" xmlns:w="http://schemas.openxmlformats.org/wordprocessingml/2006/main" xmlns:w14="http://schemas.microsoft.com/office/word/2010/wordml" xmlns:w15="http://schemas.microsoft.com/office/word/2012/wordml" xmlns:w16se="http://schemas.microsoft.com/office/word/2015/wordml/symex" xmlns:wpg="http://schemas.microsoft.com/office/word/2010/wordprocessingGroup" xmlns:wpi="http://schemas.microsoft.com/office/word/2010/wordprocessingInk" xmlns:wne="http://schemas.microsoft.com/office/word/2006/wordml" xmlns:wps="http://schemas.microsoft.com/office/word/2010/wordprocessingShape" mc:Ignorable="w14 w15 w16se wp14">
+<w:document xmlns:wpc="http://schemas.microsoft.com/office/word/2010/wordprocessingCanvas" xmlns:mc="http://schemas.openxmlformats.org/markup-compatibility/2006" xmlns:o="urn:schemas-microsoft-com:office:office" xmlns:r="http://schemas.openxmlformats.org/officeDocument/2006/relationships" xmlns:m="http://schemas.openxmlformats.org/officeDocument/2006/math" xmlns:v="urn:schemas-microsoft-com:vml" xmlns:wp14="http://schemas.microsoft.com/office/word/2010/wordprocessingDrawing" xmlns:wp="http://schemas.openxmlformats.org/drawingml/2006/wordprocessingDrawing" xmlns:w10="urn:schemas-microsoft-com:office:word" xmlns:w="http://schemas.openxmlformats.org/wordprocessingml/2006/main" xmlns:w14="http://schemas.microsoft.com/office/word/2010/wordml" xmlns:wpg="http://schemas.microsoft.com/office/word/2010/wordprocessingGroup" xmlns:wpi="http://schemas.microsoft.com/office/word/2010/wordprocessingInk" xmlns:wne="http://schemas.microsoft.com/office/word/2006/wordml" xmlns:wps="http://schemas.microsoft.com/office/word/2010/wordprocessingShape" mc:Ignorable="w14 wp14">
   <w:body>
     <w:p>
       <w:pPr>
-        <w:pStyle w:val="a9"/>
+        <w:pStyle w:val="a6"/>
         <w:pBdr>
           <w:bottom w:val="single" w:sz="4" w:space="0" w:color="auto"/>
         </w:pBdr>
@@ -693,7 +693,7 @@
           </w:tcPr>
           <w:p>
             <w:pPr>
-              <w:pStyle w:val="afd"/>
+              <w:pStyle w:val="af2"/>
               <w:spacing w:line="240" w:lineRule="auto"/>
               <w:rPr>
                 <w:szCs w:val="21"/>
@@ -3251,7 +3251,7 @@
         <w:widowControl/>
         <w:jc w:val="left"/>
         <w:rPr>
-          <w:rFonts w:ascii="Times New Roman" w:hAnsi="Times New Roman" w:hint="eastAsia"/>
+          <w:rFonts w:ascii="Times New Roman" w:hAnsi="Times New Roman"/>
           <w:color w:val="FF0000"/>
           <w:kern w:val="0"/>
         </w:rPr>
@@ -3260,8 +3260,8 @@
       <w:bookmarkEnd w:id="0"/>
     </w:p>
     <w:sectPr>
-      <w:footerReference w:type="default" r:id="rId9"/>
-      <w:footerReference w:type="first" r:id="rId10"/>
+      <w:footerReference w:type="default" r:id="rId10"/>
+      <w:footerReference w:type="first" r:id="rId11"/>
       <w:pgSz w:w="11906" w:h="16838"/>
       <w:pgMar w:top="1134" w:right="1418" w:bottom="1134" w:left="1418" w:header="567" w:footer="567" w:gutter="0"/>
       <w:pgNumType w:start="1"/>
@@ -3274,7 +3274,7 @@
 </file>
 
 <file path=word/endnotes.xml><?xml version="1.0" encoding="utf-8"?>
-<w:endnotes xmlns:wpc="http://schemas.microsoft.com/office/word/2010/wordprocessingCanvas" xmlns:cx="http://schemas.microsoft.com/office/drawing/2014/chartex" xmlns:mc="http://schemas.openxmlformats.org/markup-compatibility/2006" xmlns:o="urn:schemas-microsoft-com:office:office" xmlns:r="http://schemas.openxmlformats.org/officeDocument/2006/relationships" xmlns:m="http://schemas.openxmlformats.org/officeDocument/2006/math" xmlns:v="urn:schemas-microsoft-com:vml" xmlns:wp14="http://schemas.microsoft.com/office/word/2010/wordprocessingDrawing" xmlns:wp="http://schemas.openxmlformats.org/drawingml/2006/wordprocessingDrawing" xmlns:w10="urn:schemas-microsoft-com:office:word" xmlns:w="http://schemas.openxmlformats.org/wordprocessingml/2006/main" xmlns:w14="http://schemas.microsoft.com/office/word/2010/wordml" xmlns:w15="http://schemas.microsoft.com/office/word/2012/wordml" xmlns:w16se="http://schemas.microsoft.com/office/word/2015/wordml/symex" xmlns:wpg="http://schemas.microsoft.com/office/word/2010/wordprocessingGroup" xmlns:wpi="http://schemas.microsoft.com/office/word/2010/wordprocessingInk" xmlns:wne="http://schemas.microsoft.com/office/word/2006/wordml" xmlns:wps="http://schemas.microsoft.com/office/word/2010/wordprocessingShape" mc:Ignorable="w14 w15 w16se wp14">
+<w:endnotes xmlns:wpc="http://schemas.microsoft.com/office/word/2010/wordprocessingCanvas" xmlns:mc="http://schemas.openxmlformats.org/markup-compatibility/2006" xmlns:o="urn:schemas-microsoft-com:office:office" xmlns:r="http://schemas.openxmlformats.org/officeDocument/2006/relationships" xmlns:m="http://schemas.openxmlformats.org/officeDocument/2006/math" xmlns:v="urn:schemas-microsoft-com:vml" xmlns:wp14="http://schemas.microsoft.com/office/word/2010/wordprocessingDrawing" xmlns:wp="http://schemas.openxmlformats.org/drawingml/2006/wordprocessingDrawing" xmlns:w10="urn:schemas-microsoft-com:office:word" xmlns:w="http://schemas.openxmlformats.org/wordprocessingml/2006/main" xmlns:w14="http://schemas.microsoft.com/office/word/2010/wordml" xmlns:wpg="http://schemas.microsoft.com/office/word/2010/wordprocessingGroup" xmlns:wpi="http://schemas.microsoft.com/office/word/2010/wordprocessingInk" xmlns:wne="http://schemas.microsoft.com/office/word/2006/wordml" xmlns:wps="http://schemas.microsoft.com/office/word/2010/wordprocessingShape" mc:Ignorable="w14 wp14">
   <w:endnote w:type="separator" w:id="-1">
     <w:p>
       <w:r>
@@ -3293,24 +3293,21 @@
 </file>
 
 <file path=word/footer1.xml><?xml version="1.0" encoding="utf-8"?>
-<w:ftr xmlns:wpc="http://schemas.microsoft.com/office/word/2010/wordprocessingCanvas" xmlns:cx="http://schemas.microsoft.com/office/drawing/2014/chartex" xmlns:mc="http://schemas.openxmlformats.org/markup-compatibility/2006" xmlns:o="urn:schemas-microsoft-com:office:office" xmlns:r="http://schemas.openxmlformats.org/officeDocument/2006/relationships" xmlns:m="http://schemas.openxmlformats.org/officeDocument/2006/math" xmlns:v="urn:schemas-microsoft-com:vml" xmlns:wp14="http://schemas.microsoft.com/office/word/2010/wordprocessingDrawing" xmlns:wp="http://schemas.openxmlformats.org/drawingml/2006/wordprocessingDrawing" xmlns:w10="urn:schemas-microsoft-com:office:word" xmlns:w="http://schemas.openxmlformats.org/wordprocessingml/2006/main" xmlns:w14="http://schemas.microsoft.com/office/word/2010/wordml" xmlns:w15="http://schemas.microsoft.com/office/word/2012/wordml" xmlns:w16se="http://schemas.microsoft.com/office/word/2015/wordml/symex" xmlns:wpg="http://schemas.microsoft.com/office/word/2010/wordprocessingGroup" xmlns:wpi="http://schemas.microsoft.com/office/word/2010/wordprocessingInk" xmlns:wne="http://schemas.microsoft.com/office/word/2006/wordml" xmlns:wps="http://schemas.microsoft.com/office/word/2010/wordprocessingShape" mc:Ignorable="w14 w15 w16se wp14">
-  <w:p>
-    <w:pPr>
-      <w:pStyle w:val="af"/>
-      <w:jc w:val="center"/>
-      <w:rPr>
-        <w:rFonts w:hint="eastAsia"/>
-      </w:rPr>
-    </w:pPr>
-    <w:sdt>
-      <w:sdtPr>
-        <w:id w:val="575559119"/>
-        <w:docPartObj>
-          <w:docPartGallery w:val="Page Numbers (Top of Page)"/>
-          <w:docPartUnique/>
-        </w:docPartObj>
-      </w:sdtPr>
-      <w:sdtContent>
+<w:ftr xmlns:wpc="http://schemas.microsoft.com/office/word/2010/wordprocessingCanvas" xmlns:mc="http://schemas.openxmlformats.org/markup-compatibility/2006" xmlns:o="urn:schemas-microsoft-com:office:office" xmlns:r="http://schemas.openxmlformats.org/officeDocument/2006/relationships" xmlns:m="http://schemas.openxmlformats.org/officeDocument/2006/math" xmlns:v="urn:schemas-microsoft-com:vml" xmlns:wp14="http://schemas.microsoft.com/office/word/2010/wordprocessingDrawing" xmlns:wp="http://schemas.openxmlformats.org/drawingml/2006/wordprocessingDrawing" xmlns:w10="urn:schemas-microsoft-com:office:word" xmlns:w="http://schemas.openxmlformats.org/wordprocessingml/2006/main" xmlns:w14="http://schemas.microsoft.com/office/word/2010/wordml" xmlns:wpg="http://schemas.microsoft.com/office/word/2010/wordprocessingGroup" xmlns:wpi="http://schemas.microsoft.com/office/word/2010/wordprocessingInk" xmlns:wne="http://schemas.microsoft.com/office/word/2006/wordml" xmlns:wps="http://schemas.microsoft.com/office/word/2010/wordprocessingShape" mc:Ignorable="w14 wp14">
+  <w:sdt>
+    <w:sdtPr>
+      <w:id w:val="-1311169858"/>
+      <w:docPartObj>
+        <w:docPartGallery w:val="Page Numbers (Top of Page)"/>
+        <w:docPartUnique/>
+      </w:docPartObj>
+    </w:sdtPr>
+    <w:sdtContent>
+      <w:p>
+        <w:pPr>
+          <w:pStyle w:val="a9"/>
+          <w:jc w:val="center"/>
+        </w:pPr>
         <w:r>
           <w:rPr>
             <w:rFonts w:cs="Times New Roman"/>
@@ -3406,14 +3403,14 @@
           </w:rPr>
           <w:t>页</w:t>
         </w:r>
-      </w:sdtContent>
-    </w:sdt>
-  </w:p>
+      </w:p>
+    </w:sdtContent>
+  </w:sdt>
 </w:ftr>
 </file>
 
 <file path=word/footer2.xml><?xml version="1.0" encoding="utf-8"?>
-<w:ftr xmlns:wpc="http://schemas.microsoft.com/office/word/2010/wordprocessingCanvas" xmlns:cx="http://schemas.microsoft.com/office/drawing/2014/chartex" xmlns:mc="http://schemas.openxmlformats.org/markup-compatibility/2006" xmlns:o="urn:schemas-microsoft-com:office:office" xmlns:r="http://schemas.openxmlformats.org/officeDocument/2006/relationships" xmlns:m="http://schemas.openxmlformats.org/officeDocument/2006/math" xmlns:v="urn:schemas-microsoft-com:vml" xmlns:wp14="http://schemas.microsoft.com/office/word/2010/wordprocessingDrawing" xmlns:wp="http://schemas.openxmlformats.org/drawingml/2006/wordprocessingDrawing" xmlns:w10="urn:schemas-microsoft-com:office:word" xmlns:w="http://schemas.openxmlformats.org/wordprocessingml/2006/main" xmlns:w14="http://schemas.microsoft.com/office/word/2010/wordml" xmlns:w15="http://schemas.microsoft.com/office/word/2012/wordml" xmlns:w16se="http://schemas.microsoft.com/office/word/2015/wordml/symex" xmlns:wpg="http://schemas.microsoft.com/office/word/2010/wordprocessingGroup" xmlns:wpi="http://schemas.microsoft.com/office/word/2010/wordprocessingInk" xmlns:wne="http://schemas.microsoft.com/office/word/2006/wordml" xmlns:wps="http://schemas.microsoft.com/office/word/2010/wordprocessingShape" mc:Ignorable="w14 w15 w16se wp14">
+<w:ftr xmlns:wpc="http://schemas.microsoft.com/office/word/2010/wordprocessingCanvas" xmlns:mc="http://schemas.openxmlformats.org/markup-compatibility/2006" xmlns:o="urn:schemas-microsoft-com:office:office" xmlns:r="http://schemas.openxmlformats.org/officeDocument/2006/relationships" xmlns:m="http://schemas.openxmlformats.org/officeDocument/2006/math" xmlns:v="urn:schemas-microsoft-com:vml" xmlns:wp14="http://schemas.microsoft.com/office/word/2010/wordprocessingDrawing" xmlns:wp="http://schemas.openxmlformats.org/drawingml/2006/wordprocessingDrawing" xmlns:w10="urn:schemas-microsoft-com:office:word" xmlns:w="http://schemas.openxmlformats.org/wordprocessingml/2006/main" xmlns:w14="http://schemas.microsoft.com/office/word/2010/wordml" xmlns:wpg="http://schemas.microsoft.com/office/word/2010/wordprocessingGroup" xmlns:wpi="http://schemas.microsoft.com/office/word/2010/wordprocessingInk" xmlns:wne="http://schemas.microsoft.com/office/word/2006/wordml" xmlns:wps="http://schemas.microsoft.com/office/word/2010/wordprocessingShape" mc:Ignorable="w14 wp14">
   <w:sdt>
     <w:sdtPr>
       <w:id w:val="977650481"/>
@@ -3436,7 +3433,7 @@
         <w:sdtContent>
           <w:p>
             <w:pPr>
-              <w:pStyle w:val="af"/>
+              <w:pStyle w:val="a9"/>
               <w:jc w:val="center"/>
             </w:pPr>
             <w:r>
@@ -3543,7 +3540,7 @@
 </file>
 
 <file path=word/footnotes.xml><?xml version="1.0" encoding="utf-8"?>
-<w:footnotes xmlns:wpc="http://schemas.microsoft.com/office/word/2010/wordprocessingCanvas" xmlns:cx="http://schemas.microsoft.com/office/drawing/2014/chartex" xmlns:mc="http://schemas.openxmlformats.org/markup-compatibility/2006" xmlns:o="urn:schemas-microsoft-com:office:office" xmlns:r="http://schemas.openxmlformats.org/officeDocument/2006/relationships" xmlns:m="http://schemas.openxmlformats.org/officeDocument/2006/math" xmlns:v="urn:schemas-microsoft-com:vml" xmlns:wp14="http://schemas.microsoft.com/office/word/2010/wordprocessingDrawing" xmlns:wp="http://schemas.openxmlformats.org/drawingml/2006/wordprocessingDrawing" xmlns:w10="urn:schemas-microsoft-com:office:word" xmlns:w="http://schemas.openxmlformats.org/wordprocessingml/2006/main" xmlns:w14="http://schemas.microsoft.com/office/word/2010/wordml" xmlns:w15="http://schemas.microsoft.com/office/word/2012/wordml" xmlns:w16se="http://schemas.microsoft.com/office/word/2015/wordml/symex" xmlns:wpg="http://schemas.microsoft.com/office/word/2010/wordprocessingGroup" xmlns:wpi="http://schemas.microsoft.com/office/word/2010/wordprocessingInk" xmlns:wne="http://schemas.microsoft.com/office/word/2006/wordml" xmlns:wps="http://schemas.microsoft.com/office/word/2010/wordprocessingShape" mc:Ignorable="w14 w15 w16se wp14">
+<w:footnotes xmlns:wpc="http://schemas.microsoft.com/office/word/2010/wordprocessingCanvas" xmlns:mc="http://schemas.openxmlformats.org/markup-compatibility/2006" xmlns:o="urn:schemas-microsoft-com:office:office" xmlns:r="http://schemas.openxmlformats.org/officeDocument/2006/relationships" xmlns:m="http://schemas.openxmlformats.org/officeDocument/2006/math" xmlns:v="urn:schemas-microsoft-com:vml" xmlns:wp14="http://schemas.microsoft.com/office/word/2010/wordprocessingDrawing" xmlns:wp="http://schemas.openxmlformats.org/drawingml/2006/wordprocessingDrawing" xmlns:w10="urn:schemas-microsoft-com:office:word" xmlns:w="http://schemas.openxmlformats.org/wordprocessingml/2006/main" xmlns:w14="http://schemas.microsoft.com/office/word/2010/wordml" xmlns:wpg="http://schemas.microsoft.com/office/word/2010/wordprocessingGroup" xmlns:wpi="http://schemas.microsoft.com/office/word/2010/wordprocessingInk" xmlns:wne="http://schemas.microsoft.com/office/word/2006/wordml" xmlns:wps="http://schemas.microsoft.com/office/word/2010/wordprocessingShape" mc:Ignorable="w14 wp14">
   <w:footnote w:type="separator" w:id="-1">
     <w:p>
       <w:r>
@@ -3562,8 +3559,8 @@
 </file>
 
 <file path=word/numbering.xml><?xml version="1.0" encoding="utf-8"?>
-<w:numbering xmlns:wpc="http://schemas.microsoft.com/office/word/2010/wordprocessingCanvas" xmlns:cx="http://schemas.microsoft.com/office/drawing/2014/chartex" xmlns:mc="http://schemas.openxmlformats.org/markup-compatibility/2006" xmlns:o="urn:schemas-microsoft-com:office:office" xmlns:r="http://schemas.openxmlformats.org/officeDocument/2006/relationships" xmlns:m="http://schemas.openxmlformats.org/officeDocument/2006/math" xmlns:v="urn:schemas-microsoft-com:vml" xmlns:wp14="http://schemas.microsoft.com/office/word/2010/wordprocessingDrawing" xmlns:wp="http://schemas.openxmlformats.org/drawingml/2006/wordprocessingDrawing" xmlns:w10="urn:schemas-microsoft-com:office:word" xmlns:w="http://schemas.openxmlformats.org/wordprocessingml/2006/main" xmlns:w14="http://schemas.microsoft.com/office/word/2010/wordml" xmlns:w15="http://schemas.microsoft.com/office/word/2012/wordml" xmlns:w16se="http://schemas.microsoft.com/office/word/2015/wordml/symex" xmlns:wpg="http://schemas.microsoft.com/office/word/2010/wordprocessingGroup" xmlns:wpi="http://schemas.microsoft.com/office/word/2010/wordprocessingInk" xmlns:wne="http://schemas.microsoft.com/office/word/2006/wordml" xmlns:wps="http://schemas.microsoft.com/office/word/2010/wordprocessingShape" mc:Ignorable="w14 w15 w16se wp14">
-  <w:abstractNum w:abstractNumId="0" w15:restartNumberingAfterBreak="0">
+<w:numbering xmlns:wpc="http://schemas.microsoft.com/office/word/2010/wordprocessingCanvas" xmlns:mc="http://schemas.openxmlformats.org/markup-compatibility/2006" xmlns:o="urn:schemas-microsoft-com:office:office" xmlns:r="http://schemas.openxmlformats.org/officeDocument/2006/relationships" xmlns:m="http://schemas.openxmlformats.org/officeDocument/2006/math" xmlns:v="urn:schemas-microsoft-com:vml" xmlns:wp14="http://schemas.microsoft.com/office/word/2010/wordprocessingDrawing" xmlns:wp="http://schemas.openxmlformats.org/drawingml/2006/wordprocessingDrawing" xmlns:w10="urn:schemas-microsoft-com:office:word" xmlns:w="http://schemas.openxmlformats.org/wordprocessingml/2006/main" xmlns:w14="http://schemas.microsoft.com/office/word/2010/wordml" xmlns:wpg="http://schemas.microsoft.com/office/word/2010/wordprocessingGroup" xmlns:wpi="http://schemas.microsoft.com/office/word/2010/wordprocessingInk" xmlns:wne="http://schemas.microsoft.com/office/word/2006/wordml" xmlns:wps="http://schemas.microsoft.com/office/word/2010/wordprocessingShape" mc:Ignorable="w14 wp14">
+  <w:abstractNum w:abstractNumId="0">
     <w:nsid w:val="0B102032"/>
     <w:multiLevelType w:val="multilevel"/>
     <w:tmpl w:val="0B102032"/>
@@ -3649,7 +3646,7 @@
       </w:pPr>
     </w:lvl>
   </w:abstractNum>
-  <w:abstractNum w:abstractNumId="1" w15:restartNumberingAfterBreak="0">
+  <w:abstractNum w:abstractNumId="1">
     <w:nsid w:val="0EEC186A"/>
     <w:multiLevelType w:val="multilevel"/>
     <w:tmpl w:val="0EEC186A"/>
@@ -3735,7 +3732,7 @@
       </w:pPr>
     </w:lvl>
   </w:abstractNum>
-  <w:abstractNum w:abstractNumId="2" w15:restartNumberingAfterBreak="0">
+  <w:abstractNum w:abstractNumId="2">
     <w:nsid w:val="13C760D0"/>
     <w:multiLevelType w:val="multilevel"/>
     <w:tmpl w:val="13C760D0"/>
@@ -3821,7 +3818,7 @@
       </w:pPr>
     </w:lvl>
   </w:abstractNum>
-  <w:abstractNum w:abstractNumId="3" w15:restartNumberingAfterBreak="0">
+  <w:abstractNum w:abstractNumId="3">
     <w:nsid w:val="13E32B0A"/>
     <w:multiLevelType w:val="multilevel"/>
     <w:tmpl w:val="13E32B0A"/>
@@ -3907,7 +3904,7 @@
       </w:pPr>
     </w:lvl>
   </w:abstractNum>
-  <w:abstractNum w:abstractNumId="4" w15:restartNumberingAfterBreak="0">
+  <w:abstractNum w:abstractNumId="4">
     <w:nsid w:val="141757A4"/>
     <w:multiLevelType w:val="multilevel"/>
     <w:tmpl w:val="141757A4"/>
@@ -3993,7 +3990,7 @@
       </w:pPr>
     </w:lvl>
   </w:abstractNum>
-  <w:abstractNum w:abstractNumId="5" w15:restartNumberingAfterBreak="0">
+  <w:abstractNum w:abstractNumId="5">
     <w:nsid w:val="1E474847"/>
     <w:multiLevelType w:val="multilevel"/>
     <w:tmpl w:val="1E474847"/>
@@ -4079,7 +4076,7 @@
       </w:pPr>
     </w:lvl>
   </w:abstractNum>
-  <w:abstractNum w:abstractNumId="6" w15:restartNumberingAfterBreak="0">
+  <w:abstractNum w:abstractNumId="6">
     <w:nsid w:val="1F970F73"/>
     <w:multiLevelType w:val="multilevel"/>
     <w:tmpl w:val="1F970F73"/>
@@ -4165,7 +4162,7 @@
       </w:pPr>
     </w:lvl>
   </w:abstractNum>
-  <w:abstractNum w:abstractNumId="7" w15:restartNumberingAfterBreak="0">
+  <w:abstractNum w:abstractNumId="7">
     <w:nsid w:val="22710777"/>
     <w:multiLevelType w:val="multilevel"/>
     <w:tmpl w:val="22710777"/>
@@ -4251,7 +4248,7 @@
       </w:pPr>
     </w:lvl>
   </w:abstractNum>
-  <w:abstractNum w:abstractNumId="8" w15:restartNumberingAfterBreak="0">
+  <w:abstractNum w:abstractNumId="8">
     <w:nsid w:val="26165696"/>
     <w:multiLevelType w:val="multilevel"/>
     <w:tmpl w:val="26165696"/>
@@ -4337,7 +4334,7 @@
       </w:pPr>
     </w:lvl>
   </w:abstractNum>
-  <w:abstractNum w:abstractNumId="9" w15:restartNumberingAfterBreak="0">
+  <w:abstractNum w:abstractNumId="9">
     <w:nsid w:val="28FA3D45"/>
     <w:multiLevelType w:val="multilevel"/>
     <w:tmpl w:val="28FA3D45"/>
@@ -4423,7 +4420,7 @@
       </w:pPr>
     </w:lvl>
   </w:abstractNum>
-  <w:abstractNum w:abstractNumId="10" w15:restartNumberingAfterBreak="0">
+  <w:abstractNum w:abstractNumId="10">
     <w:nsid w:val="37A03454"/>
     <w:multiLevelType w:val="multilevel"/>
     <w:tmpl w:val="37A03454"/>
@@ -4512,7 +4509,7 @@
       </w:pPr>
     </w:lvl>
   </w:abstractNum>
-  <w:abstractNum w:abstractNumId="11" w15:restartNumberingAfterBreak="0">
+  <w:abstractNum w:abstractNumId="11">
     <w:nsid w:val="41C861A9"/>
     <w:multiLevelType w:val="multilevel"/>
     <w:tmpl w:val="41C861A9"/>
@@ -4598,7 +4595,7 @@
       </w:pPr>
     </w:lvl>
   </w:abstractNum>
-  <w:abstractNum w:abstractNumId="12" w15:restartNumberingAfterBreak="0">
+  <w:abstractNum w:abstractNumId="12">
     <w:nsid w:val="446229BE"/>
     <w:multiLevelType w:val="multilevel"/>
     <w:tmpl w:val="446229BE"/>
@@ -4684,7 +4681,7 @@
       </w:pPr>
     </w:lvl>
   </w:abstractNum>
-  <w:abstractNum w:abstractNumId="13" w15:restartNumberingAfterBreak="0">
+  <w:abstractNum w:abstractNumId="13">
     <w:nsid w:val="47996DBC"/>
     <w:multiLevelType w:val="multilevel"/>
     <w:tmpl w:val="47996DBC"/>
@@ -4770,7 +4767,7 @@
       </w:pPr>
     </w:lvl>
   </w:abstractNum>
-  <w:abstractNum w:abstractNumId="14" w15:restartNumberingAfterBreak="0">
+  <w:abstractNum w:abstractNumId="14">
     <w:nsid w:val="4EF13AFC"/>
     <w:multiLevelType w:val="multilevel"/>
     <w:tmpl w:val="4EF13AFC"/>
@@ -4856,7 +4853,7 @@
       </w:pPr>
     </w:lvl>
   </w:abstractNum>
-  <w:abstractNum w:abstractNumId="15" w15:restartNumberingAfterBreak="0">
+  <w:abstractNum w:abstractNumId="15">
     <w:nsid w:val="538C7537"/>
     <w:multiLevelType w:val="multilevel"/>
     <w:tmpl w:val="538C7537"/>
@@ -4945,7 +4942,7 @@
       </w:pPr>
     </w:lvl>
   </w:abstractNum>
-  <w:abstractNum w:abstractNumId="16" w15:restartNumberingAfterBreak="0">
+  <w:abstractNum w:abstractNumId="16">
     <w:nsid w:val="55085AF7"/>
     <w:multiLevelType w:val="multilevel"/>
     <w:tmpl w:val="55085AF7"/>
@@ -5031,7 +5028,7 @@
       </w:pPr>
     </w:lvl>
   </w:abstractNum>
-  <w:abstractNum w:abstractNumId="17" w15:restartNumberingAfterBreak="0">
+  <w:abstractNum w:abstractNumId="17">
     <w:nsid w:val="55FC6AF2"/>
     <w:multiLevelType w:val="multilevel"/>
     <w:tmpl w:val="55FC6AF2"/>
@@ -5117,7 +5114,7 @@
       </w:pPr>
     </w:lvl>
   </w:abstractNum>
-  <w:abstractNum w:abstractNumId="18" w15:restartNumberingAfterBreak="0">
+  <w:abstractNum w:abstractNumId="18">
     <w:nsid w:val="56A9557F"/>
     <w:multiLevelType w:val="multilevel"/>
     <w:tmpl w:val="56A9557F"/>
@@ -5203,7 +5200,7 @@
       </w:pPr>
     </w:lvl>
   </w:abstractNum>
-  <w:abstractNum w:abstractNumId="19" w15:restartNumberingAfterBreak="0">
+  <w:abstractNum w:abstractNumId="19">
     <w:nsid w:val="5BB56DF9"/>
     <w:multiLevelType w:val="multilevel"/>
     <w:tmpl w:val="5BB56DF9"/>
@@ -5289,7 +5286,7 @@
       </w:pPr>
     </w:lvl>
   </w:abstractNum>
-  <w:abstractNum w:abstractNumId="20" w15:restartNumberingAfterBreak="0">
+  <w:abstractNum w:abstractNumId="20">
     <w:nsid w:val="64001E1C"/>
     <w:multiLevelType w:val="multilevel"/>
     <w:tmpl w:val="64001E1C"/>
@@ -5378,7 +5375,7 @@
       </w:pPr>
     </w:lvl>
   </w:abstractNum>
-  <w:abstractNum w:abstractNumId="21" w15:restartNumberingAfterBreak="0">
+  <w:abstractNum w:abstractNumId="21">
     <w:nsid w:val="72C36DDF"/>
     <w:multiLevelType w:val="multilevel"/>
     <w:tmpl w:val="72C36DDF"/>
@@ -5464,7 +5461,7 @@
       </w:pPr>
     </w:lvl>
   </w:abstractNum>
-  <w:abstractNum w:abstractNumId="22" w15:restartNumberingAfterBreak="0">
+  <w:abstractNum w:abstractNumId="22">
     <w:nsid w:val="74BC2ED6"/>
     <w:multiLevelType w:val="multilevel"/>
     <w:tmpl w:val="74BC2ED6"/>
@@ -5550,7 +5547,7 @@
       </w:pPr>
     </w:lvl>
   </w:abstractNum>
-  <w:abstractNum w:abstractNumId="23" w15:restartNumberingAfterBreak="0">
+  <w:abstractNum w:abstractNumId="23">
     <w:nsid w:val="792C4FBE"/>
     <w:multiLevelType w:val="multilevel"/>
     <w:tmpl w:val="792C4FBE"/>
@@ -5636,7 +5633,7 @@
       </w:pPr>
     </w:lvl>
   </w:abstractNum>
-  <w:abstractNum w:abstractNumId="24" w15:restartNumberingAfterBreak="0">
+  <w:abstractNum w:abstractNumId="24">
     <w:nsid w:val="7B362CB5"/>
     <w:multiLevelType w:val="multilevel"/>
     <w:tmpl w:val="7B362CB5"/>
@@ -5722,7 +5719,7 @@
       </w:pPr>
     </w:lvl>
   </w:abstractNum>
-  <w:abstractNum w:abstractNumId="25" w15:restartNumberingAfterBreak="0">
+  <w:abstractNum w:abstractNumId="25">
     <w:nsid w:val="7C7A2891"/>
     <w:multiLevelType w:val="multilevel"/>
     <w:tmpl w:val="7C7A2891"/>
@@ -5893,7 +5890,7 @@
 </file>
 
 <file path=word/styles.xml><?xml version="1.0" encoding="utf-8"?>
-<w:styles xmlns:mc="http://schemas.openxmlformats.org/markup-compatibility/2006" xmlns:r="http://schemas.openxmlformats.org/officeDocument/2006/relationships" xmlns:w="http://schemas.openxmlformats.org/wordprocessingml/2006/main" xmlns:w14="http://schemas.microsoft.com/office/word/2010/wordml" xmlns:w15="http://schemas.microsoft.com/office/word/2012/wordml" xmlns:w16se="http://schemas.microsoft.com/office/word/2015/wordml/symex" mc:Ignorable="w14 w15 w16se">
+<w:styles xmlns:mc="http://schemas.openxmlformats.org/markup-compatibility/2006" xmlns:r="http://schemas.openxmlformats.org/officeDocument/2006/relationships" xmlns:w="http://schemas.openxmlformats.org/wordprocessingml/2006/main" xmlns:w14="http://schemas.microsoft.com/office/word/2010/wordml" mc:Ignorable="w14">
   <w:docDefaults>
     <w:rPrDefault>
       <w:rPr>
@@ -5903,376 +5900,153 @@
     </w:rPrDefault>
     <w:pPrDefault/>
   </w:docDefaults>
-  <w:latentStyles w:defLockedState="0" w:defUIPriority="99" w:defSemiHidden="0" w:defUnhideWhenUsed="0" w:defQFormat="0" w:count="371">
-    <w:lsdException w:name="Normal" w:uiPriority="0" w:qFormat="1"/>
-    <w:lsdException w:name="heading 1" w:uiPriority="9" w:qFormat="1"/>
-    <w:lsdException w:name="heading 2" w:uiPriority="9" w:unhideWhenUsed="1" w:qFormat="1"/>
-    <w:lsdException w:name="heading 3" w:semiHidden="1" w:uiPriority="9" w:unhideWhenUsed="1" w:qFormat="1"/>
-    <w:lsdException w:name="heading 4" w:semiHidden="1" w:uiPriority="9" w:unhideWhenUsed="1" w:qFormat="1"/>
-    <w:lsdException w:name="heading 5" w:semiHidden="1" w:uiPriority="9" w:unhideWhenUsed="1" w:qFormat="1"/>
-    <w:lsdException w:name="heading 6" w:uiPriority="9" w:unhideWhenUsed="1" w:qFormat="1"/>
-    <w:lsdException w:name="heading 7" w:semiHidden="1" w:uiPriority="9" w:unhideWhenUsed="1" w:qFormat="1"/>
-    <w:lsdException w:name="heading 8" w:semiHidden="1" w:uiPriority="9" w:unhideWhenUsed="1" w:qFormat="1"/>
-    <w:lsdException w:name="heading 9" w:semiHidden="1" w:uiPriority="9" w:unhideWhenUsed="1" w:qFormat="1"/>
-    <w:lsdException w:name="index 1" w:semiHidden="1" w:unhideWhenUsed="1"/>
-    <w:lsdException w:name="index 2" w:semiHidden="1" w:unhideWhenUsed="1"/>
-    <w:lsdException w:name="index 3" w:semiHidden="1" w:unhideWhenUsed="1"/>
-    <w:lsdException w:name="index 4" w:semiHidden="1" w:unhideWhenUsed="1"/>
-    <w:lsdException w:name="index 5" w:semiHidden="1" w:unhideWhenUsed="1"/>
-    <w:lsdException w:name="index 6" w:semiHidden="1" w:unhideWhenUsed="1"/>
-    <w:lsdException w:name="index 7" w:semiHidden="1" w:unhideWhenUsed="1"/>
-    <w:lsdException w:name="index 8" w:semiHidden="1" w:unhideWhenUsed="1"/>
-    <w:lsdException w:name="index 9" w:semiHidden="1" w:unhideWhenUsed="1"/>
-    <w:lsdException w:name="toc 1" w:semiHidden="1" w:uiPriority="39" w:unhideWhenUsed="1" w:qFormat="1"/>
-    <w:lsdException w:name="toc 2" w:semiHidden="1" w:uiPriority="39" w:unhideWhenUsed="1" w:qFormat="1"/>
-    <w:lsdException w:name="toc 3" w:semiHidden="1" w:uiPriority="39" w:unhideWhenUsed="1" w:qFormat="1"/>
-    <w:lsdException w:name="toc 4" w:semiHidden="1" w:uiPriority="39" w:unhideWhenUsed="1"/>
-    <w:lsdException w:name="toc 5" w:semiHidden="1" w:uiPriority="39" w:unhideWhenUsed="1"/>
-    <w:lsdException w:name="toc 6" w:semiHidden="1" w:uiPriority="39" w:unhideWhenUsed="1"/>
-    <w:lsdException w:name="toc 7" w:semiHidden="1" w:uiPriority="39" w:unhideWhenUsed="1"/>
-    <w:lsdException w:name="toc 8" w:semiHidden="1" w:uiPriority="39" w:unhideWhenUsed="1"/>
-    <w:lsdException w:name="toc 9" w:semiHidden="1" w:uiPriority="39" w:unhideWhenUsed="1"/>
-    <w:lsdException w:name="Normal Indent" w:semiHidden="1" w:unhideWhenUsed="1"/>
-    <w:lsdException w:name="footnote text" w:semiHidden="1" w:unhideWhenUsed="1"/>
-    <w:lsdException w:name="annotation text" w:unhideWhenUsed="1" w:qFormat="1"/>
-    <w:lsdException w:name="header" w:unhideWhenUsed="1" w:qFormat="1"/>
-    <w:lsdException w:name="footer" w:unhideWhenUsed="1" w:qFormat="1"/>
-    <w:lsdException w:name="index heading" w:semiHidden="1" w:unhideWhenUsed="1"/>
-    <w:lsdException w:name="caption" w:uiPriority="35" w:unhideWhenUsed="1" w:qFormat="1"/>
-    <w:lsdException w:name="table of figures" w:semiHidden="1" w:unhideWhenUsed="1"/>
-    <w:lsdException w:name="envelope address" w:semiHidden="1" w:unhideWhenUsed="1"/>
-    <w:lsdException w:name="envelope return" w:semiHidden="1" w:unhideWhenUsed="1"/>
-    <w:lsdException w:name="footnote reference" w:semiHidden="1" w:unhideWhenUsed="1"/>
-    <w:lsdException w:name="annotation reference" w:uiPriority="0" w:unhideWhenUsed="1" w:qFormat="1"/>
-    <w:lsdException w:name="line number" w:semiHidden="1" w:unhideWhenUsed="1"/>
-    <w:lsdException w:name="page number" w:semiHidden="1" w:unhideWhenUsed="1"/>
-    <w:lsdException w:name="endnote reference" w:semiHidden="1" w:unhideWhenUsed="1"/>
-    <w:lsdException w:name="endnote text" w:semiHidden="1" w:unhideWhenUsed="1"/>
-    <w:lsdException w:name="table of authorities" w:semiHidden="1" w:unhideWhenUsed="1"/>
-    <w:lsdException w:name="macro" w:semiHidden="1" w:unhideWhenUsed="1"/>
-    <w:lsdException w:name="toa heading" w:semiHidden="1" w:unhideWhenUsed="1"/>
-    <w:lsdException w:name="List" w:semiHidden="1" w:unhideWhenUsed="1"/>
-    <w:lsdException w:name="List Bullet" w:semiHidden="1" w:unhideWhenUsed="1"/>
-    <w:lsdException w:name="List Number" w:semiHidden="1" w:unhideWhenUsed="1"/>
-    <w:lsdException w:name="List 2" w:semiHidden="1" w:unhideWhenUsed="1"/>
-    <w:lsdException w:name="List 3" w:semiHidden="1" w:unhideWhenUsed="1"/>
-    <w:lsdException w:name="List 4" w:semiHidden="1" w:unhideWhenUsed="1"/>
-    <w:lsdException w:name="List 5" w:semiHidden="1" w:unhideWhenUsed="1"/>
-    <w:lsdException w:name="List Bullet 2" w:semiHidden="1" w:unhideWhenUsed="1"/>
-    <w:lsdException w:name="List Bullet 3" w:semiHidden="1" w:unhideWhenUsed="1"/>
-    <w:lsdException w:name="List Bullet 4" w:semiHidden="1" w:unhideWhenUsed="1"/>
-    <w:lsdException w:name="List Bullet 5" w:semiHidden="1" w:unhideWhenUsed="1"/>
-    <w:lsdException w:name="List Number 2" w:semiHidden="1" w:unhideWhenUsed="1"/>
-    <w:lsdException w:name="List Number 3" w:semiHidden="1" w:unhideWhenUsed="1"/>
-    <w:lsdException w:name="List Number 4" w:semiHidden="1" w:unhideWhenUsed="1"/>
-    <w:lsdException w:name="List Number 5" w:semiHidden="1" w:unhideWhenUsed="1"/>
-    <w:lsdException w:name="Title" w:uiPriority="0" w:qFormat="1"/>
-    <w:lsdException w:name="Closing" w:semiHidden="1" w:unhideWhenUsed="1"/>
-    <w:lsdException w:name="Signature" w:semiHidden="1" w:unhideWhenUsed="1"/>
-    <w:lsdException w:name="Default Paragraph Font" w:semiHidden="1" w:uiPriority="1" w:unhideWhenUsed="1" w:qFormat="1"/>
-    <w:lsdException w:name="Body Text" w:semiHidden="1" w:unhideWhenUsed="1" w:qFormat="1"/>
-    <w:lsdException w:name="Body Text Indent" w:semiHidden="1" w:unhideWhenUsed="1"/>
-    <w:lsdException w:name="List Continue" w:semiHidden="1" w:unhideWhenUsed="1"/>
-    <w:lsdException w:name="List Continue 2" w:semiHidden="1" w:unhideWhenUsed="1"/>
-    <w:lsdException w:name="List Continue 3" w:semiHidden="1" w:unhideWhenUsed="1"/>
-    <w:lsdException w:name="List Continue 4" w:semiHidden="1" w:unhideWhenUsed="1"/>
-    <w:lsdException w:name="List Continue 5" w:semiHidden="1" w:unhideWhenUsed="1"/>
-    <w:lsdException w:name="Message Header" w:semiHidden="1" w:unhideWhenUsed="1"/>
-    <w:lsdException w:name="Subtitle" w:uiPriority="11" w:qFormat="1"/>
-    <w:lsdException w:name="Salutation" w:semiHidden="1" w:unhideWhenUsed="1"/>
-    <w:lsdException w:name="Date" w:semiHidden="1" w:unhideWhenUsed="1" w:qFormat="1"/>
-    <w:lsdException w:name="Body Text First Indent" w:semiHidden="1" w:unhideWhenUsed="1"/>
-    <w:lsdException w:name="Body Text First Indent 2" w:semiHidden="1" w:unhideWhenUsed="1"/>
-    <w:lsdException w:name="Note Heading" w:semiHidden="1" w:unhideWhenUsed="1"/>
-    <w:lsdException w:name="Body Text 2" w:semiHidden="1" w:unhideWhenUsed="1"/>
-    <w:lsdException w:name="Body Text 3" w:semiHidden="1" w:unhideWhenUsed="1"/>
-    <w:lsdException w:name="Body Text Indent 2" w:semiHidden="1" w:unhideWhenUsed="1"/>
-    <w:lsdException w:name="Body Text Indent 3" w:semiHidden="1" w:unhideWhenUsed="1"/>
-    <w:lsdException w:name="Block Text" w:semiHidden="1" w:unhideWhenUsed="1"/>
-    <w:lsdException w:name="Hyperlink" w:semiHidden="1" w:unhideWhenUsed="1"/>
-    <w:lsdException w:name="FollowedHyperlink" w:semiHidden="1" w:unhideWhenUsed="1"/>
-    <w:lsdException w:name="Strong" w:uiPriority="22" w:qFormat="1"/>
-    <w:lsdException w:name="Emphasis" w:uiPriority="20" w:qFormat="1"/>
-    <w:lsdException w:name="Document Map" w:semiHidden="1" w:unhideWhenUsed="1" w:qFormat="1"/>
-    <w:lsdException w:name="Plain Text" w:semiHidden="1" w:unhideWhenUsed="1"/>
-    <w:lsdException w:name="E-mail Signature" w:semiHidden="1" w:unhideWhenUsed="1"/>
-    <w:lsdException w:name="HTML Top of Form" w:semiHidden="1" w:unhideWhenUsed="1"/>
-    <w:lsdException w:name="HTML Bottom of Form" w:semiHidden="1" w:unhideWhenUsed="1"/>
-    <w:lsdException w:name="Normal (Web)" w:semiHidden="1" w:unhideWhenUsed="1"/>
-    <w:lsdException w:name="HTML Acronym" w:semiHidden="1" w:unhideWhenUsed="1"/>
-    <w:lsdException w:name="HTML Address" w:semiHidden="1" w:unhideWhenUsed="1"/>
-    <w:lsdException w:name="HTML Cite" w:semiHidden="1" w:unhideWhenUsed="1"/>
-    <w:lsdException w:name="HTML Code" w:semiHidden="1" w:unhideWhenUsed="1"/>
-    <w:lsdException w:name="HTML Definition" w:semiHidden="1" w:unhideWhenUsed="1"/>
-    <w:lsdException w:name="HTML Keyboard" w:semiHidden="1" w:unhideWhenUsed="1"/>
-    <w:lsdException w:name="HTML Preformatted" w:semiHidden="1" w:unhideWhenUsed="1"/>
-    <w:lsdException w:name="HTML Sample" w:semiHidden="1" w:unhideWhenUsed="1"/>
-    <w:lsdException w:name="HTML Typewriter" w:semiHidden="1" w:unhideWhenUsed="1"/>
-    <w:lsdException w:name="HTML Variable" w:semiHidden="1" w:unhideWhenUsed="1"/>
-    <w:lsdException w:name="Normal Table" w:semiHidden="1" w:unhideWhenUsed="1"/>
-    <w:lsdException w:name="annotation subject" w:semiHidden="1" w:unhideWhenUsed="1" w:qFormat="1"/>
-    <w:lsdException w:name="No List" w:semiHidden="1" w:unhideWhenUsed="1"/>
-    <w:lsdException w:name="Outline List 1" w:semiHidden="1" w:unhideWhenUsed="1"/>
-    <w:lsdException w:name="Outline List 2" w:semiHidden="1" w:unhideWhenUsed="1"/>
-    <w:lsdException w:name="Outline List 3" w:semiHidden="1" w:unhideWhenUsed="1"/>
-    <w:lsdException w:name="Table Simple 1" w:semiHidden="1" w:unhideWhenUsed="1"/>
-    <w:lsdException w:name="Table Simple 2" w:semiHidden="1" w:unhideWhenUsed="1"/>
-    <w:lsdException w:name="Table Simple 3" w:semiHidden="1" w:unhideWhenUsed="1"/>
-    <w:lsdException w:name="Table Classic 1" w:semiHidden="1" w:unhideWhenUsed="1"/>
-    <w:lsdException w:name="Table Classic 2" w:semiHidden="1" w:unhideWhenUsed="1"/>
-    <w:lsdException w:name="Table Classic 3" w:semiHidden="1" w:unhideWhenUsed="1"/>
-    <w:lsdException w:name="Table Classic 4" w:semiHidden="1" w:unhideWhenUsed="1"/>
-    <w:lsdException w:name="Table Colorful 1" w:semiHidden="1" w:unhideWhenUsed="1"/>
-    <w:lsdException w:name="Table Colorful 2" w:semiHidden="1" w:unhideWhenUsed="1"/>
-    <w:lsdException w:name="Table Colorful 3" w:semiHidden="1" w:unhideWhenUsed="1"/>
-    <w:lsdException w:name="Table Columns 1" w:semiHidden="1" w:unhideWhenUsed="1"/>
-    <w:lsdException w:name="Table Columns 2" w:semiHidden="1" w:unhideWhenUsed="1"/>
-    <w:lsdException w:name="Table Columns 3" w:semiHidden="1" w:unhideWhenUsed="1"/>
-    <w:lsdException w:name="Table Columns 4" w:semiHidden="1" w:unhideWhenUsed="1"/>
-    <w:lsdException w:name="Table Columns 5" w:semiHidden="1" w:unhideWhenUsed="1"/>
-    <w:lsdException w:name="Table Grid 1" w:semiHidden="1" w:unhideWhenUsed="1"/>
-    <w:lsdException w:name="Table Grid 2" w:semiHidden="1" w:unhideWhenUsed="1"/>
-    <w:lsdException w:name="Table Grid 3" w:semiHidden="1" w:unhideWhenUsed="1"/>
-    <w:lsdException w:name="Table Grid 4" w:semiHidden="1" w:unhideWhenUsed="1"/>
-    <w:lsdException w:name="Table Grid 5" w:semiHidden="1" w:unhideWhenUsed="1"/>
-    <w:lsdException w:name="Table Grid 6" w:semiHidden="1" w:unhideWhenUsed="1"/>
-    <w:lsdException w:name="Table Grid 7" w:semiHidden="1" w:unhideWhenUsed="1"/>
-    <w:lsdException w:name="Table Grid 8" w:semiHidden="1" w:unhideWhenUsed="1"/>
-    <w:lsdException w:name="Table List 1" w:semiHidden="1" w:unhideWhenUsed="1"/>
-    <w:lsdException w:name="Table List 2" w:semiHidden="1" w:unhideWhenUsed="1"/>
-    <w:lsdException w:name="Table List 3" w:semiHidden="1" w:unhideWhenUsed="1"/>
-    <w:lsdException w:name="Table List 4" w:semiHidden="1" w:unhideWhenUsed="1"/>
-    <w:lsdException w:name="Table List 5" w:semiHidden="1" w:unhideWhenUsed="1"/>
-    <w:lsdException w:name="Table List 6" w:semiHidden="1" w:unhideWhenUsed="1"/>
-    <w:lsdException w:name="Table List 7" w:semiHidden="1" w:unhideWhenUsed="1"/>
-    <w:lsdException w:name="Table List 8" w:semiHidden="1" w:unhideWhenUsed="1"/>
-    <w:lsdException w:name="Table 3D effects 1" w:semiHidden="1" w:unhideWhenUsed="1"/>
-    <w:lsdException w:name="Table 3D effects 2" w:semiHidden="1" w:unhideWhenUsed="1"/>
-    <w:lsdException w:name="Table 3D effects 3" w:semiHidden="1" w:unhideWhenUsed="1"/>
-    <w:lsdException w:name="Table Contemporary" w:semiHidden="1" w:unhideWhenUsed="1"/>
-    <w:lsdException w:name="Table Elegant" w:semiHidden="1" w:unhideWhenUsed="1"/>
-    <w:lsdException w:name="Table Professional" w:semiHidden="1" w:unhideWhenUsed="1"/>
-    <w:lsdException w:name="Table Subtle 1" w:semiHidden="1" w:unhideWhenUsed="1"/>
-    <w:lsdException w:name="Table Subtle 2" w:semiHidden="1" w:unhideWhenUsed="1"/>
-    <w:lsdException w:name="Table Web 1" w:semiHidden="1" w:unhideWhenUsed="1"/>
-    <w:lsdException w:name="Table Web 2" w:semiHidden="1" w:unhideWhenUsed="1"/>
-    <w:lsdException w:name="Table Web 3" w:semiHidden="1" w:unhideWhenUsed="1"/>
-    <w:lsdException w:name="Balloon Text" w:semiHidden="1" w:unhideWhenUsed="1" w:qFormat="1"/>
-    <w:lsdException w:name="Table Grid" w:uiPriority="59" w:qFormat="1"/>
-    <w:lsdException w:name="Table Theme" w:semiHidden="1" w:unhideWhenUsed="1"/>
-    <w:lsdException w:name="Placeholder Text" w:semiHidden="1"/>
-    <w:lsdException w:name="No Spacing" w:uiPriority="1" w:qFormat="1"/>
-    <w:lsdException w:name="Light Shading" w:uiPriority="60"/>
-    <w:lsdException w:name="Light List" w:uiPriority="61"/>
-    <w:lsdException w:name="Light Grid" w:uiPriority="62"/>
-    <w:lsdException w:name="Medium Shading 1" w:uiPriority="63"/>
-    <w:lsdException w:name="Medium Shading 2" w:uiPriority="64"/>
-    <w:lsdException w:name="Medium List 1" w:uiPriority="65"/>
-    <w:lsdException w:name="Medium List 2" w:uiPriority="66"/>
-    <w:lsdException w:name="Medium Grid 1" w:uiPriority="67"/>
-    <w:lsdException w:name="Medium Grid 2" w:uiPriority="68"/>
-    <w:lsdException w:name="Medium Grid 3" w:uiPriority="69"/>
-    <w:lsdException w:name="Dark List" w:uiPriority="70"/>
-    <w:lsdException w:name="Colorful Shading" w:uiPriority="71"/>
-    <w:lsdException w:name="Colorful List" w:uiPriority="72"/>
-    <w:lsdException w:name="Colorful Grid" w:uiPriority="73"/>
-    <w:lsdException w:name="Light Shading Accent 1" w:uiPriority="60"/>
-    <w:lsdException w:name="Light List Accent 1" w:uiPriority="61"/>
-    <w:lsdException w:name="Light Grid Accent 1" w:uiPriority="62"/>
-    <w:lsdException w:name="Medium Shading 1 Accent 1" w:uiPriority="63"/>
-    <w:lsdException w:name="Medium Shading 2 Accent 1" w:uiPriority="64"/>
-    <w:lsdException w:name="Medium List 1 Accent 1" w:uiPriority="65"/>
-    <w:lsdException w:name="Revision" w:semiHidden="1"/>
-    <w:lsdException w:name="List Paragraph" w:uiPriority="34" w:qFormat="1"/>
-    <w:lsdException w:name="Medium List 2 Accent 1" w:uiPriority="66"/>
-    <w:lsdException w:name="Medium Grid 1 Accent 1" w:uiPriority="67"/>
-    <w:lsdException w:name="Medium Grid 2 Accent 1" w:uiPriority="68"/>
-    <w:lsdException w:name="Medium Grid 3 Accent 1" w:uiPriority="69"/>
-    <w:lsdException w:name="Dark List Accent 1" w:uiPriority="70"/>
-    <w:lsdException w:name="Colorful Shading Accent 1" w:uiPriority="71"/>
-    <w:lsdException w:name="Colorful List Accent 1" w:uiPriority="72"/>
-    <w:lsdException w:name="Colorful Grid Accent 1" w:uiPriority="73"/>
-    <w:lsdException w:name="Light Shading Accent 2" w:uiPriority="60"/>
-    <w:lsdException w:name="Light List Accent 2" w:uiPriority="61"/>
-    <w:lsdException w:name="Light Grid Accent 2" w:uiPriority="62"/>
-    <w:lsdException w:name="Medium Shading 1 Accent 2" w:uiPriority="63"/>
-    <w:lsdException w:name="Medium Shading 2 Accent 2" w:uiPriority="64"/>
-    <w:lsdException w:name="Medium List 1 Accent 2" w:uiPriority="65"/>
-    <w:lsdException w:name="Medium List 2 Accent 2" w:uiPriority="66"/>
-    <w:lsdException w:name="Medium Grid 1 Accent 2" w:uiPriority="67"/>
-    <w:lsdException w:name="Medium Grid 2 Accent 2" w:uiPriority="68"/>
-    <w:lsdException w:name="Medium Grid 3 Accent 2" w:uiPriority="69"/>
-    <w:lsdException w:name="Dark List Accent 2" w:uiPriority="70"/>
-    <w:lsdException w:name="Colorful Shading Accent 2" w:uiPriority="71"/>
-    <w:lsdException w:name="Colorful List Accent 2" w:uiPriority="72"/>
-    <w:lsdException w:name="Colorful Grid Accent 2" w:uiPriority="73"/>
-    <w:lsdException w:name="Light Shading Accent 3" w:uiPriority="60"/>
-    <w:lsdException w:name="Light List Accent 3" w:uiPriority="61"/>
-    <w:lsdException w:name="Light Grid Accent 3" w:uiPriority="62"/>
-    <w:lsdException w:name="Medium Shading 1 Accent 3" w:uiPriority="63"/>
-    <w:lsdException w:name="Medium Shading 2 Accent 3" w:uiPriority="64"/>
-    <w:lsdException w:name="Medium List 1 Accent 3" w:uiPriority="65"/>
-    <w:lsdException w:name="Medium List 2 Accent 3" w:uiPriority="66"/>
-    <w:lsdException w:name="Medium Grid 1 Accent 3" w:uiPriority="67"/>
-    <w:lsdException w:name="Medium Grid 2 Accent 3" w:uiPriority="68"/>
-    <w:lsdException w:name="Medium Grid 3 Accent 3" w:uiPriority="69"/>
-    <w:lsdException w:name="Dark List Accent 3" w:uiPriority="70"/>
-    <w:lsdException w:name="Colorful Shading Accent 3" w:uiPriority="71"/>
-    <w:lsdException w:name="Colorful List Accent 3" w:uiPriority="72"/>
-    <w:lsdException w:name="Colorful Grid Accent 3" w:uiPriority="73"/>
-    <w:lsdException w:name="Light Shading Accent 4" w:uiPriority="60"/>
-    <w:lsdException w:name="Light List Accent 4" w:uiPriority="61"/>
-    <w:lsdException w:name="Light Grid Accent 4" w:uiPriority="62"/>
-    <w:lsdException w:name="Medium Shading 1 Accent 4" w:uiPriority="63"/>
-    <w:lsdException w:name="Medium Shading 2 Accent 4" w:uiPriority="64"/>
-    <w:lsdException w:name="Medium List 1 Accent 4" w:uiPriority="65"/>
-    <w:lsdException w:name="Medium List 2 Accent 4" w:uiPriority="66"/>
-    <w:lsdException w:name="Medium Grid 1 Accent 4" w:uiPriority="67"/>
-    <w:lsdException w:name="Medium Grid 2 Accent 4" w:uiPriority="68"/>
-    <w:lsdException w:name="Medium Grid 3 Accent 4" w:uiPriority="69"/>
-    <w:lsdException w:name="Dark List Accent 4" w:uiPriority="70"/>
-    <w:lsdException w:name="Colorful Shading Accent 4" w:uiPriority="71"/>
-    <w:lsdException w:name="Colorful List Accent 4" w:uiPriority="72"/>
-    <w:lsdException w:name="Colorful Grid Accent 4" w:uiPriority="73"/>
-    <w:lsdException w:name="Light Shading Accent 5" w:uiPriority="60"/>
-    <w:lsdException w:name="Light List Accent 5" w:uiPriority="61"/>
-    <w:lsdException w:name="Light Grid Accent 5" w:uiPriority="62"/>
-    <w:lsdException w:name="Medium Shading 1 Accent 5" w:uiPriority="63"/>
-    <w:lsdException w:name="Medium Shading 2 Accent 5" w:uiPriority="64"/>
-    <w:lsdException w:name="Medium List 1 Accent 5" w:uiPriority="65"/>
-    <w:lsdException w:name="Medium List 2 Accent 5" w:uiPriority="66"/>
-    <w:lsdException w:name="Medium Grid 1 Accent 5" w:uiPriority="67"/>
-    <w:lsdException w:name="Medium Grid 2 Accent 5" w:uiPriority="68"/>
-    <w:lsdException w:name="Medium Grid 3 Accent 5" w:uiPriority="69"/>
-    <w:lsdException w:name="Dark List Accent 5" w:uiPriority="70"/>
-    <w:lsdException w:name="Colorful Shading Accent 5" w:uiPriority="71"/>
-    <w:lsdException w:name="Colorful List Accent 5" w:uiPriority="72"/>
-    <w:lsdException w:name="Colorful Grid Accent 5" w:uiPriority="73"/>
-    <w:lsdException w:name="Light Shading Accent 6" w:uiPriority="60"/>
-    <w:lsdException w:name="Light List Accent 6" w:uiPriority="61"/>
-    <w:lsdException w:name="Light Grid Accent 6" w:uiPriority="62"/>
-    <w:lsdException w:name="Medium Shading 1 Accent 6" w:uiPriority="63"/>
-    <w:lsdException w:name="Medium Shading 2 Accent 6" w:uiPriority="64"/>
-    <w:lsdException w:name="Medium List 1 Accent 6" w:uiPriority="65"/>
-    <w:lsdException w:name="Medium List 2 Accent 6" w:uiPriority="66"/>
-    <w:lsdException w:name="Medium Grid 1 Accent 6" w:uiPriority="67"/>
-    <w:lsdException w:name="Medium Grid 2 Accent 6" w:uiPriority="68"/>
-    <w:lsdException w:name="Medium Grid 3 Accent 6" w:uiPriority="69"/>
-    <w:lsdException w:name="Dark List Accent 6" w:uiPriority="70"/>
-    <w:lsdException w:name="Colorful Shading Accent 6" w:uiPriority="71"/>
-    <w:lsdException w:name="Colorful List Accent 6" w:uiPriority="72"/>
-    <w:lsdException w:name="Colorful Grid Accent 6" w:uiPriority="73"/>
-    <w:lsdException w:name="Subtle Emphasis" w:uiPriority="19" w:qFormat="1"/>
-    <w:lsdException w:name="Intense Emphasis" w:uiPriority="21" w:qFormat="1"/>
-    <w:lsdException w:name="Subtle Reference" w:uiPriority="31" w:qFormat="1"/>
-    <w:lsdException w:name="Intense Reference" w:uiPriority="32" w:qFormat="1"/>
-    <w:lsdException w:name="Book Title" w:uiPriority="33" w:qFormat="1"/>
-    <w:lsdException w:name="Bibliography" w:semiHidden="1" w:uiPriority="37" w:unhideWhenUsed="1"/>
-    <w:lsdException w:name="TOC Heading" w:semiHidden="1" w:uiPriority="39" w:unhideWhenUsed="1" w:qFormat="1"/>
-    <w:lsdException w:name="Plain Table 1" w:uiPriority="41"/>
-    <w:lsdException w:name="Plain Table 2" w:uiPriority="42"/>
-    <w:lsdException w:name="Plain Table 3" w:uiPriority="43"/>
-    <w:lsdException w:name="Plain Table 4" w:uiPriority="44"/>
-    <w:lsdException w:name="Plain Table 5" w:uiPriority="45"/>
-    <w:lsdException w:name="Grid Table Light" w:uiPriority="40"/>
-    <w:lsdException w:name="Grid Table 1 Light" w:uiPriority="46"/>
-    <w:lsdException w:name="Grid Table 2" w:uiPriority="47"/>
-    <w:lsdException w:name="Grid Table 3" w:uiPriority="48"/>
-    <w:lsdException w:name="Grid Table 4" w:uiPriority="49"/>
-    <w:lsdException w:name="Grid Table 5 Dark" w:uiPriority="50"/>
-    <w:lsdException w:name="Grid Table 6 Colorful" w:uiPriority="51"/>
-    <w:lsdException w:name="Grid Table 7 Colorful" w:uiPriority="52"/>
-    <w:lsdException w:name="Grid Table 1 Light Accent 1" w:uiPriority="46"/>
-    <w:lsdException w:name="Grid Table 2 Accent 1" w:uiPriority="47"/>
-    <w:lsdException w:name="Grid Table 3 Accent 1" w:uiPriority="48"/>
-    <w:lsdException w:name="Grid Table 4 Accent 1" w:uiPriority="49"/>
-    <w:lsdException w:name="Grid Table 5 Dark Accent 1" w:uiPriority="50"/>
-    <w:lsdException w:name="Grid Table 6 Colorful Accent 1" w:uiPriority="51"/>
-    <w:lsdException w:name="Grid Table 7 Colorful Accent 1" w:uiPriority="52"/>
-    <w:lsdException w:name="Grid Table 1 Light Accent 2" w:uiPriority="46"/>
-    <w:lsdException w:name="Grid Table 2 Accent 2" w:uiPriority="47"/>
-    <w:lsdException w:name="Grid Table 3 Accent 2" w:uiPriority="48"/>
-    <w:lsdException w:name="Grid Table 4 Accent 2" w:uiPriority="49"/>
-    <w:lsdException w:name="Grid Table 5 Dark Accent 2" w:uiPriority="50"/>
-    <w:lsdException w:name="Grid Table 6 Colorful Accent 2" w:uiPriority="51"/>
-    <w:lsdException w:name="Grid Table 7 Colorful Accent 2" w:uiPriority="52"/>
-    <w:lsdException w:name="Grid Table 1 Light Accent 3" w:uiPriority="46"/>
-    <w:lsdException w:name="Grid Table 2 Accent 3" w:uiPriority="47"/>
-    <w:lsdException w:name="Grid Table 3 Accent 3" w:uiPriority="48"/>
-    <w:lsdException w:name="Grid Table 4 Accent 3" w:uiPriority="49"/>
-    <w:lsdException w:name="Grid Table 5 Dark Accent 3" w:uiPriority="50"/>
-    <w:lsdException w:name="Grid Table 6 Colorful Accent 3" w:uiPriority="51"/>
-    <w:lsdException w:name="Grid Table 7 Colorful Accent 3" w:uiPriority="52"/>
-    <w:lsdException w:name="Grid Table 1 Light Accent 4" w:uiPriority="46"/>
-    <w:lsdException w:name="Grid Table 2 Accent 4" w:uiPriority="47"/>
-    <w:lsdException w:name="Grid Table 3 Accent 4" w:uiPriority="48"/>
-    <w:lsdException w:name="Grid Table 4 Accent 4" w:uiPriority="49"/>
-    <w:lsdException w:name="Grid Table 5 Dark Accent 4" w:uiPriority="50"/>
-    <w:lsdException w:name="Grid Table 6 Colorful Accent 4" w:uiPriority="51"/>
-    <w:lsdException w:name="Grid Table 7 Colorful Accent 4" w:uiPriority="52"/>
-    <w:lsdException w:name="Grid Table 1 Light Accent 5" w:uiPriority="46"/>
-    <w:lsdException w:name="Grid Table 2 Accent 5" w:uiPriority="47"/>
-    <w:lsdException w:name="Grid Table 3 Accent 5" w:uiPriority="48"/>
-    <w:lsdException w:name="Grid Table 4 Accent 5" w:uiPriority="49"/>
-    <w:lsdException w:name="Grid Table 5 Dark Accent 5" w:uiPriority="50"/>
-    <w:lsdException w:name="Grid Table 6 Colorful Accent 5" w:uiPriority="51"/>
-    <w:lsdException w:name="Grid Table 7 Colorful Accent 5" w:uiPriority="52"/>
-    <w:lsdException w:name="Grid Table 1 Light Accent 6" w:uiPriority="46"/>
-    <w:lsdException w:name="Grid Table 2 Accent 6" w:uiPriority="47"/>
-    <w:lsdException w:name="Grid Table 3 Accent 6" w:uiPriority="48"/>
-    <w:lsdException w:name="Grid Table 4 Accent 6" w:uiPriority="49"/>
-    <w:lsdException w:name="Grid Table 5 Dark Accent 6" w:uiPriority="50"/>
-    <w:lsdException w:name="Grid Table 6 Colorful Accent 6" w:uiPriority="51"/>
-    <w:lsdException w:name="Grid Table 7 Colorful Accent 6" w:uiPriority="52"/>
-    <w:lsdException w:name="List Table 1 Light" w:uiPriority="46"/>
-    <w:lsdException w:name="List Table 2" w:uiPriority="47"/>
-    <w:lsdException w:name="List Table 3" w:uiPriority="48"/>
-    <w:lsdException w:name="List Table 4" w:uiPriority="49"/>
-    <w:lsdException w:name="List Table 5 Dark" w:uiPriority="50"/>
-    <w:lsdException w:name="List Table 6 Colorful" w:uiPriority="51"/>
-    <w:lsdException w:name="List Table 7 Colorful" w:uiPriority="52"/>
-    <w:lsdException w:name="List Table 1 Light Accent 1" w:uiPriority="46"/>
-    <w:lsdException w:name="List Table 2 Accent 1" w:uiPriority="47"/>
-    <w:lsdException w:name="List Table 3 Accent 1" w:uiPriority="48"/>
-    <w:lsdException w:name="List Table 4 Accent 1" w:uiPriority="49"/>
-    <w:lsdException w:name="List Table 5 Dark Accent 1" w:uiPriority="50"/>
-    <w:lsdException w:name="List Table 6 Colorful Accent 1" w:uiPriority="51"/>
-    <w:lsdException w:name="List Table 7 Colorful Accent 1" w:uiPriority="52"/>
-    <w:lsdException w:name="List Table 1 Light Accent 2" w:uiPriority="46"/>
-    <w:lsdException w:name="List Table 2 Accent 2" w:uiPriority="47"/>
-    <w:lsdException w:name="List Table 3 Accent 2" w:uiPriority="48"/>
-    <w:lsdException w:name="List Table 4 Accent 2" w:uiPriority="49"/>
-    <w:lsdException w:name="List Table 5 Dark Accent 2" w:uiPriority="50"/>
-    <w:lsdException w:name="List Table 6 Colorful Accent 2" w:uiPriority="51"/>
-    <w:lsdException w:name="List Table 7 Colorful Accent 2" w:uiPriority="52"/>
-    <w:lsdException w:name="List Table 1 Light Accent 3" w:uiPriority="46"/>
-    <w:lsdException w:name="List Table 2 Accent 3" w:uiPriority="47"/>
-    <w:lsdException w:name="List Table 3 Accent 3" w:uiPriority="48"/>
-    <w:lsdException w:name="List Table 4 Accent 3" w:uiPriority="49"/>
-    <w:lsdException w:name="List Table 5 Dark Accent 3" w:uiPriority="50"/>
-    <w:lsdException w:name="List Table 6 Colorful Accent 3" w:uiPriority="51"/>
-    <w:lsdException w:name="List Table 7 Colorful Accent 3" w:uiPriority="52"/>
-    <w:lsdException w:name="List Table 1 Light Accent 4" w:uiPriority="46"/>
-    <w:lsdException w:name="List Table 2 Accent 4" w:uiPriority="47"/>
-    <w:lsdException w:name="List Table 3 Accent 4" w:uiPriority="48"/>
-    <w:lsdException w:name="List Table 4 Accent 4" w:uiPriority="49"/>
-    <w:lsdException w:name="List Table 5 Dark Accent 4" w:uiPriority="50"/>
-    <w:lsdException w:name="List Table 6 Colorful Accent 4" w:uiPriority="51"/>
-    <w:lsdException w:name="List Table 7 Colorful Accent 4" w:uiPriority="52"/>
-    <w:lsdException w:name="List Table 1 Light Accent 5" w:uiPriority="46"/>
-    <w:lsdException w:name="List Table 2 Accent 5" w:uiPriority="47"/>
-    <w:lsdException w:name="List Table 3 Accent 5" w:uiPriority="48"/>
-    <w:lsdException w:name="List Table 4 Accent 5" w:uiPriority="49"/>
-    <w:lsdException w:name="List Table 5 Dark Accent 5" w:uiPriority="50"/>
-    <w:lsdException w:name="List Table 6 Colorful Accent 5" w:uiPriority="51"/>
-    <w:lsdException w:name="List Table 7 Colorful Accent 5" w:uiPriority="52"/>
-    <w:lsdException w:name="List Table 1 Light Accent 6" w:uiPriority="46"/>
-    <w:lsdException w:name="List Table 2 Accent 6" w:uiPriority="47"/>
-    <w:lsdException w:name="List Table 3 Accent 6" w:uiPriority="48"/>
-    <w:lsdException w:name="List Table 4 Accent 6" w:uiPriority="49"/>
-    <w:lsdException w:name="List Table 5 Dark Accent 6" w:uiPriority="50"/>
-    <w:lsdException w:name="List Table 6 Colorful Accent 6" w:uiPriority="51"/>
-    <w:lsdException w:name="List Table 7 Colorful Accent 6" w:uiPriority="52"/>
+  <w:latentStyles w:defLockedState="0" w:defUIPriority="99" w:defSemiHidden="1" w:defUnhideWhenUsed="1" w:defQFormat="0" w:count="267">
+    <w:lsdException w:name="Normal" w:semiHidden="0" w:uiPriority="0" w:unhideWhenUsed="0" w:qFormat="1"/>
+    <w:lsdException w:name="heading 1" w:semiHidden="0" w:uiPriority="9" w:unhideWhenUsed="0" w:qFormat="1"/>
+    <w:lsdException w:name="heading 2" w:semiHidden="0" w:uiPriority="9" w:qFormat="1"/>
+    <w:lsdException w:name="heading 3" w:uiPriority="9" w:qFormat="1"/>
+    <w:lsdException w:name="heading 4" w:uiPriority="9" w:qFormat="1"/>
+    <w:lsdException w:name="heading 5" w:uiPriority="9" w:qFormat="1"/>
+    <w:lsdException w:name="heading 6" w:semiHidden="0" w:uiPriority="9" w:qFormat="1"/>
+    <w:lsdException w:name="heading 7" w:uiPriority="9" w:qFormat="1"/>
+    <w:lsdException w:name="heading 8" w:uiPriority="9" w:qFormat="1"/>
+    <w:lsdException w:name="heading 9" w:uiPriority="9" w:qFormat="1"/>
+    <w:lsdException w:name="toc 1" w:uiPriority="39" w:qFormat="1"/>
+    <w:lsdException w:name="toc 2" w:uiPriority="39" w:qFormat="1"/>
+    <w:lsdException w:name="toc 3" w:uiPriority="39" w:qFormat="1"/>
+    <w:lsdException w:name="toc 4" w:uiPriority="39"/>
+    <w:lsdException w:name="toc 5" w:uiPriority="39"/>
+    <w:lsdException w:name="toc 6" w:uiPriority="39"/>
+    <w:lsdException w:name="toc 7" w:uiPriority="39"/>
+    <w:lsdException w:name="toc 8" w:uiPriority="39"/>
+    <w:lsdException w:name="toc 9" w:uiPriority="39"/>
+    <w:lsdException w:name="annotation text" w:semiHidden="0" w:qFormat="1"/>
+    <w:lsdException w:name="header" w:semiHidden="0" w:qFormat="1"/>
+    <w:lsdException w:name="footer" w:semiHidden="0" w:qFormat="1"/>
+    <w:lsdException w:name="caption" w:semiHidden="0" w:uiPriority="35" w:qFormat="1"/>
+    <w:lsdException w:name="annotation reference" w:semiHidden="0" w:uiPriority="0" w:qFormat="1"/>
+    <w:lsdException w:name="Title" w:semiHidden="0" w:uiPriority="0" w:unhideWhenUsed="0" w:qFormat="1"/>
+    <w:lsdException w:name="Default Paragraph Font" w:uiPriority="1" w:qFormat="1"/>
+    <w:lsdException w:name="Body Text" w:qFormat="1"/>
+    <w:lsdException w:name="Subtitle" w:semiHidden="0" w:uiPriority="11" w:unhideWhenUsed="0" w:qFormat="1"/>
+    <w:lsdException w:name="Date" w:qFormat="1"/>
+    <w:lsdException w:name="Strong" w:semiHidden="0" w:uiPriority="22" w:unhideWhenUsed="0" w:qFormat="1"/>
+    <w:lsdException w:name="Emphasis" w:semiHidden="0" w:uiPriority="20" w:unhideWhenUsed="0" w:qFormat="1"/>
+    <w:lsdException w:name="Document Map" w:qFormat="1"/>
+    <w:lsdException w:name="annotation subject" w:qFormat="1"/>
+    <w:lsdException w:name="Balloon Text" w:qFormat="1"/>
+    <w:lsdException w:name="Table Grid" w:semiHidden="0" w:uiPriority="59" w:unhideWhenUsed="0" w:qFormat="1"/>
+    <w:lsdException w:name="Placeholder Text" w:unhideWhenUsed="0"/>
+    <w:lsdException w:name="No Spacing" w:semiHidden="0" w:uiPriority="1" w:unhideWhenUsed="0" w:qFormat="1"/>
+    <w:lsdException w:name="Light Shading" w:semiHidden="0" w:uiPriority="60" w:unhideWhenUsed="0"/>
+    <w:lsdException w:name="Light List" w:semiHidden="0" w:uiPriority="61" w:unhideWhenUsed="0"/>
+    <w:lsdException w:name="Light Grid" w:semiHidden="0" w:uiPriority="62" w:unhideWhenUsed="0"/>
+    <w:lsdException w:name="Medium Shading 1" w:semiHidden="0" w:uiPriority="63" w:unhideWhenUsed="0"/>
+    <w:lsdException w:name="Medium Shading 2" w:semiHidden="0" w:uiPriority="64" w:unhideWhenUsed="0"/>
+    <w:lsdException w:name="Medium List 1" w:semiHidden="0" w:uiPriority="65" w:unhideWhenUsed="0"/>
+    <w:lsdException w:name="Medium List 2" w:semiHidden="0" w:uiPriority="66" w:unhideWhenUsed="0"/>
+    <w:lsdException w:name="Medium Grid 1" w:semiHidden="0" w:uiPriority="67" w:unhideWhenUsed="0"/>
+    <w:lsdException w:name="Medium Grid 2" w:semiHidden="0" w:uiPriority="68" w:unhideWhenUsed="0"/>
+    <w:lsdException w:name="Medium Grid 3" w:semiHidden="0" w:uiPriority="69" w:unhideWhenUsed="0"/>
+    <w:lsdException w:name="Dark List" w:semiHidden="0" w:uiPriority="70" w:unhideWhenUsed="0"/>
+    <w:lsdException w:name="Colorful Shading" w:semiHidden="0" w:uiPriority="71" w:unhideWhenUsed="0"/>
+    <w:lsdException w:name="Colorful List" w:semiHidden="0" w:uiPriority="72" w:unhideWhenUsed="0"/>
+    <w:lsdException w:name="Colorful Grid" w:semiHidden="0" w:uiPriority="73" w:unhideWhenUsed="0"/>
+    <w:lsdException w:name="Light Shading Accent 1" w:semiHidden="0" w:uiPriority="60" w:unhideWhenUsed="0"/>
+    <w:lsdException w:name="Light List Accent 1" w:semiHidden="0" w:uiPriority="61" w:unhideWhenUsed="0"/>
+    <w:lsdException w:name="Light Grid Accent 1" w:semiHidden="0" w:uiPriority="62" w:unhideWhenUsed="0"/>
+    <w:lsdException w:name="Medium Shading 1 Accent 1" w:semiHidden="0" w:uiPriority="63" w:unhideWhenUsed="0"/>
+    <w:lsdException w:name="Medium Shading 2 Accent 1" w:semiHidden="0" w:uiPriority="64" w:unhideWhenUsed="0"/>
+    <w:lsdException w:name="Medium List 1 Accent 1" w:semiHidden="0" w:uiPriority="65" w:unhideWhenUsed="0"/>
+    <w:lsdException w:name="Revision" w:unhideWhenUsed="0"/>
+    <w:lsdException w:name="List Paragraph" w:semiHidden="0" w:uiPriority="34" w:unhideWhenUsed="0" w:qFormat="1"/>
+    <w:lsdException w:name="Quote" w:semiHidden="0" w:unhideWhenUsed="0"/>
+    <w:lsdException w:name="Intense Quote" w:semiHidden="0" w:unhideWhenUsed="0"/>
+    <w:lsdException w:name="Medium List 2 Accent 1" w:semiHidden="0" w:uiPriority="66" w:unhideWhenUsed="0"/>
+    <w:lsdException w:name="Medium Grid 1 Accent 1" w:semiHidden="0" w:uiPriority="67" w:unhideWhenUsed="0"/>
+    <w:lsdException w:name="Medium Grid 2 Accent 1" w:semiHidden="0" w:uiPriority="68" w:unhideWhenUsed="0"/>
+    <w:lsdException w:name="Medium Grid 3 Accent 1" w:semiHidden="0" w:uiPriority="69" w:unhideWhenUsed="0"/>
+    <w:lsdException w:name="Dark List Accent 1" w:semiHidden="0" w:uiPriority="70" w:unhideWhenUsed="0"/>
+    <w:lsdException w:name="Colorful Shading Accent 1" w:semiHidden="0" w:uiPriority="71" w:unhideWhenUsed="0"/>
+    <w:lsdException w:name="Colorful List Accent 1" w:semiHidden="0" w:uiPriority="72" w:unhideWhenUsed="0"/>
+    <w:lsdException w:name="Colorful Grid Accent 1" w:semiHidden="0" w:uiPriority="73" w:unhideWhenUsed="0"/>
+    <w:lsdException w:name="Light Shading Accent 2" w:semiHidden="0" w:uiPriority="60" w:unhideWhenUsed="0"/>
+    <w:lsdException w:name="Light List Accent 2" w:semiHidden="0" w:uiPriority="61" w:unhideWhenUsed="0"/>
+    <w:lsdException w:name="Light Grid Accent 2" w:semiHidden="0" w:uiPriority="62" w:unhideWhenUsed="0"/>
+    <w:lsdException w:name="Medium Shading 1 Accent 2" w:semiHidden="0" w:uiPriority="63" w:unhideWhenUsed="0"/>
+    <w:lsdException w:name="Medium Shading 2 Accent 2" w:semiHidden="0" w:uiPriority="64" w:unhideWhenUsed="0"/>
+    <w:lsdException w:name="Medium List 1 Accent 2" w:semiHidden="0" w:uiPriority="65" w:unhideWhenUsed="0"/>
+    <w:lsdException w:name="Medium List 2 Accent 2" w:semiHidden="0" w:uiPriority="66" w:unhideWhenUsed="0"/>
+    <w:lsdException w:name="Medium Grid 1 Accent 2" w:semiHidden="0" w:uiPriority="67" w:unhideWhenUsed="0"/>
+    <w:lsdException w:name="Medium Grid 2 Accent 2" w:semiHidden="0" w:uiPriority="68" w:unhideWhenUsed="0"/>
+    <w:lsdException w:name="Medium Grid 3 Accent 2" w:semiHidden="0" w:uiPriority="69" w:unhideWhenUsed="0"/>
+    <w:lsdException w:name="Dark List Accent 2" w:semiHidden="0" w:uiPriority="70" w:unhideWhenUsed="0"/>
+    <w:lsdException w:name="Colorful Shading Accent 2" w:semiHidden="0" w:uiPriority="71" w:unhideWhenUsed="0"/>
+    <w:lsdException w:name="Colorful List Accent 2" w:semiHidden="0" w:uiPriority="72" w:unhideWhenUsed="0"/>
+    <w:lsdException w:name="Colorful Grid Accent 2" w:semiHidden="0" w:uiPriority="73" w:unhideWhenUsed="0"/>
+    <w:lsdException w:name="Light Shading Accent 3" w:semiHidden="0" w:uiPriority="60" w:unhideWhenUsed="0"/>
+    <w:lsdException w:name="Light List Accent 3" w:semiHidden="0" w:uiPriority="61" w:unhideWhenUsed="0"/>
+    <w:lsdException w:name="Light Grid Accent 3" w:semiHidden="0" w:uiPriority="62" w:unhideWhenUsed="0"/>
+    <w:lsdException w:name="Medium Shading 1 Accent 3" w:semiHidden="0" w:uiPriority="63" w:unhideWhenUsed="0"/>
+    <w:lsdException w:name="Medium Shading 2 Accent 3" w:semiHidden="0" w:uiPriority="64" w:unhideWhenUsed="0"/>
+    <w:lsdException w:name="Medium List 1 Accent 3" w:semiHidden="0" w:uiPriority="65" w:unhideWhenUsed="0"/>
+    <w:lsdException w:name="Medium List 2 Accent 3" w:semiHidden="0" w:uiPriority="66" w:unhideWhenUsed="0"/>
+    <w:lsdException w:name="Medium Grid 1 Accent 3" w:semiHidden="0" w:uiPriority="67" w:unhideWhenUsed="0"/>
+    <w:lsdException w:name="Medium Grid 2 Accent 3" w:semiHidden="0" w:uiPriority="68" w:unhideWhenUsed="0"/>
+    <w:lsdException w:name="Medium Grid 3 Accent 3" w:semiHidden="0" w:uiPriority="69" w:unhideWhenUsed="0"/>
+    <w:lsdException w:name="Dark List Accent 3" w:semiHidden="0" w:uiPriority="70" w:unhideWhenUsed="0"/>
+    <w:lsdException w:name="Colorful Shading Accent 3" w:semiHidden="0" w:uiPriority="71" w:unhideWhenUsed="0"/>
+    <w:lsdException w:name="Colorful List Accent 3" w:semiHidden="0" w:uiPriority="72" w:unhideWhenUsed="0"/>
+    <w:lsdException w:name="Colorful Grid Accent 3" w:semiHidden="0" w:uiPriority="73" w:unhideWhenUsed="0"/>
+    <w:lsdException w:name="Light Shading Accent 4" w:semiHidden="0" w:uiPriority="60" w:unhideWhenUsed="0"/>
+    <w:lsdException w:name="Light List Accent 4" w:semiHidden="0" w:uiPriority="61" w:unhideWhenUsed="0"/>
+    <w:lsdException w:name="Light Grid Accent 4" w:semiHidden="0" w:uiPriority="62" w:unhideWhenUsed="0"/>
+    <w:lsdException w:name="Medium Shading 1 Accent 4" w:semiHidden="0" w:uiPriority="63" w:unhideWhenUsed="0"/>
+    <w:lsdException w:name="Medium Shading 2 Accent 4" w:semiHidden="0" w:uiPriority="64" w:unhideWhenUsed="0"/>
+    <w:lsdException w:name="Medium List 1 Accent 4" w:semiHidden="0" w:uiPriority="65" w:unhideWhenUsed="0"/>
+    <w:lsdException w:name="Medium List 2 Accent 4" w:semiHidden="0" w:uiPriority="66" w:unhideWhenUsed="0"/>
+    <w:lsdException w:name="Medium Grid 1 Accent 4" w:semiHidden="0" w:uiPriority="67" w:unhideWhenUsed="0"/>
+    <w:lsdException w:name="Medium Grid 2 Accent 4" w:semiHidden="0" w:uiPriority="68" w:unhideWhenUsed="0"/>
+    <w:lsdException w:name="Medium Grid 3 Accent 4" w:semiHidden="0" w:uiPriority="69" w:unhideWhenUsed="0"/>
+    <w:lsdException w:name="Dark List Accent 4" w:semiHidden="0" w:uiPriority="70" w:unhideWhenUsed="0"/>
+    <w:lsdException w:name="Colorful Shading Accent 4" w:semiHidden="0" w:uiPriority="71" w:unhideWhenUsed="0"/>
+    <w:lsdException w:name="Colorful List Accent 4" w:semiHidden="0" w:uiPriority="72" w:unhideWhenUsed="0"/>
+    <w:lsdException w:name="Colorful Grid Accent 4" w:semiHidden="0" w:uiPriority="73" w:unhideWhenUsed="0"/>
+    <w:lsdException w:name="Light Shading Accent 5" w:semiHidden="0" w:uiPriority="60" w:unhideWhenUsed="0"/>
+    <w:lsdException w:name="Light List Accent 5" w:semiHidden="0" w:uiPriority="61" w:unhideWhenUsed="0"/>
+    <w:lsdException w:name="Light Grid Accent 5" w:semiHidden="0" w:uiPriority="62" w:unhideWhenUsed="0"/>
+    <w:lsdException w:name="Medium Shading 1 Accent 5" w:semiHidden="0" w:uiPriority="63" w:unhideWhenUsed="0"/>
+    <w:lsdException w:name="Medium Shading 2 Accent 5" w:semiHidden="0" w:uiPriority="64" w:unhideWhenUsed="0"/>
+    <w:lsdException w:name="Medium List 1 Accent 5" w:semiHidden="0" w:uiPriority="65" w:unhideWhenUsed="0"/>
+    <w:lsdException w:name="Medium List 2 Accent 5" w:semiHidden="0" w:uiPriority="66" w:unhideWhenUsed="0"/>
+    <w:lsdException w:name="Medium Grid 1 Accent 5" w:semiHidden="0" w:uiPriority="67" w:unhideWhenUsed="0"/>
+    <w:lsdException w:name="Medium Grid 2 Accent 5" w:semiHidden="0" w:uiPriority="68" w:unhideWhenUsed="0"/>
+    <w:lsdException w:name="Medium Grid 3 Accent 5" w:semiHidden="0" w:uiPriority="69" w:unhideWhenUsed="0"/>
+    <w:lsdException w:name="Dark List Accent 5" w:semiHidden="0" w:uiPriority="70" w:unhideWhenUsed="0"/>
+    <w:lsdException w:name="Colorful Shading Accent 5" w:semiHidden="0" w:uiPriority="71" w:unhideWhenUsed="0"/>
+    <w:lsdException w:name="Colorful List Accent 5" w:semiHidden="0" w:uiPriority="72" w:unhideWhenUsed="0"/>
+    <w:lsdException w:name="Colorful Grid Accent 5" w:semiHidden="0" w:uiPriority="73" w:unhideWhenUsed="0"/>
+    <w:lsdException w:name="Light Shading Accent 6" w:semiHidden="0" w:uiPriority="60" w:unhideWhenUsed="0"/>
+    <w:lsdException w:name="Light List Accent 6" w:semiHidden="0" w:uiPriority="61" w:unhideWhenUsed="0"/>
+    <w:lsdException w:name="Light Grid Accent 6" w:semiHidden="0" w:uiPriority="62" w:unhideWhenUsed="0"/>
+    <w:lsdException w:name="Medium Shading 1 Accent 6" w:semiHidden="0" w:uiPriority="63" w:unhideWhenUsed="0"/>
+    <w:lsdException w:name="Medium Shading 2 Accent 6" w:semiHidden="0" w:uiPriority="64" w:unhideWhenUsed="0"/>
+    <w:lsdException w:name="Medium List 1 Accent 6" w:semiHidden="0" w:uiPriority="65" w:unhideWhenUsed="0"/>
+    <w:lsdException w:name="Medium List 2 Accent 6" w:semiHidden="0" w:uiPriority="66" w:unhideWhenUsed="0"/>
+    <w:lsdException w:name="Medium Grid 1 Accent 6" w:semiHidden="0" w:uiPriority="67" w:unhideWhenUsed="0"/>
+    <w:lsdException w:name="Medium Grid 2 Accent 6" w:semiHidden="0" w:uiPriority="68" w:unhideWhenUsed="0"/>
+    <w:lsdException w:name="Medium Grid 3 Accent 6" w:semiHidden="0" w:uiPriority="69" w:unhideWhenUsed="0"/>
+    <w:lsdException w:name="Dark List Accent 6" w:semiHidden="0" w:uiPriority="70" w:unhideWhenUsed="0"/>
+    <w:lsdException w:name="Colorful Shading Accent 6" w:semiHidden="0" w:uiPriority="71" w:unhideWhenUsed="0"/>
+    <w:lsdException w:name="Colorful List Accent 6" w:semiHidden="0" w:uiPriority="72" w:unhideWhenUsed="0"/>
+    <w:lsdException w:name="Colorful Grid Accent 6" w:semiHidden="0" w:uiPriority="73" w:unhideWhenUsed="0"/>
+    <w:lsdException w:name="Subtle Emphasis" w:semiHidden="0" w:uiPriority="19" w:unhideWhenUsed="0" w:qFormat="1"/>
+    <w:lsdException w:name="Intense Emphasis" w:semiHidden="0" w:uiPriority="21" w:unhideWhenUsed="0" w:qFormat="1"/>
+    <w:lsdException w:name="Subtle Reference" w:semiHidden="0" w:uiPriority="31" w:unhideWhenUsed="0" w:qFormat="1"/>
+    <w:lsdException w:name="Intense Reference" w:semiHidden="0" w:uiPriority="32" w:unhideWhenUsed="0" w:qFormat="1"/>
+    <w:lsdException w:name="Book Title" w:semiHidden="0" w:uiPriority="33" w:unhideWhenUsed="0" w:qFormat="1"/>
+    <w:lsdException w:name="Bibliography" w:uiPriority="37"/>
+    <w:lsdException w:name="TOC Heading" w:uiPriority="39" w:qFormat="1"/>
   </w:latentStyles>
   <w:style w:type="paragraph" w:default="1" w:styleId="a">
     <w:name w:val="Normal"/>
@@ -6292,7 +6066,7 @@
     <w:name w:val="heading 1"/>
     <w:basedOn w:val="a"/>
     <w:next w:val="a"/>
-    <w:link w:val="10"/>
+    <w:link w:val="1Char"/>
     <w:uiPriority w:val="9"/>
     <w:qFormat/>
     <w:pPr>
@@ -6314,7 +6088,7 @@
     <w:name w:val="heading 2"/>
     <w:basedOn w:val="a"/>
     <w:next w:val="a"/>
-    <w:link w:val="20"/>
+    <w:link w:val="2Char"/>
     <w:uiPriority w:val="9"/>
     <w:unhideWhenUsed/>
     <w:qFormat/>
@@ -6336,7 +6110,7 @@
     <w:name w:val="heading 3"/>
     <w:basedOn w:val="a"/>
     <w:next w:val="a"/>
-    <w:link w:val="30"/>
+    <w:link w:val="3Char"/>
     <w:uiPriority w:val="9"/>
     <w:semiHidden/>
     <w:unhideWhenUsed/>
@@ -6359,7 +6133,7 @@
     <w:name w:val="heading 4"/>
     <w:basedOn w:val="a"/>
     <w:next w:val="a"/>
-    <w:link w:val="40"/>
+    <w:link w:val="4Char"/>
     <w:uiPriority w:val="9"/>
     <w:semiHidden/>
     <w:unhideWhenUsed/>
@@ -6382,7 +6156,7 @@
     <w:name w:val="heading 5"/>
     <w:basedOn w:val="a"/>
     <w:next w:val="a"/>
-    <w:link w:val="50"/>
+    <w:link w:val="5Char"/>
     <w:uiPriority w:val="9"/>
     <w:semiHidden/>
     <w:unhideWhenUsed/>
@@ -6405,7 +6179,7 @@
     <w:name w:val="heading 6"/>
     <w:basedOn w:val="a"/>
     <w:next w:val="a"/>
-    <w:link w:val="60"/>
+    <w:link w:val="6Char"/>
     <w:uiPriority w:val="9"/>
     <w:unhideWhenUsed/>
     <w:qFormat/>
@@ -6427,7 +6201,7 @@
     <w:name w:val="heading 7"/>
     <w:basedOn w:val="a"/>
     <w:next w:val="a"/>
-    <w:link w:val="70"/>
+    <w:link w:val="7Char"/>
     <w:uiPriority w:val="9"/>
     <w:semiHidden/>
     <w:unhideWhenUsed/>
@@ -6449,7 +6223,7 @@
     <w:name w:val="heading 8"/>
     <w:basedOn w:val="a"/>
     <w:next w:val="a"/>
-    <w:link w:val="80"/>
+    <w:link w:val="8Char"/>
     <w:uiPriority w:val="9"/>
     <w:semiHidden/>
     <w:unhideWhenUsed/>
@@ -6471,7 +6245,7 @@
     <w:name w:val="heading 9"/>
     <w:basedOn w:val="a"/>
     <w:next w:val="a"/>
-    <w:link w:val="90"/>
+    <w:link w:val="9Char"/>
     <w:uiPriority w:val="9"/>
     <w:semiHidden/>
     <w:unhideWhenUsed/>
@@ -6519,7 +6293,7 @@
     <w:name w:val="caption"/>
     <w:basedOn w:val="a"/>
     <w:next w:val="a"/>
-    <w:link w:val="a4"/>
+    <w:link w:val="Char"/>
     <w:uiPriority w:val="35"/>
     <w:unhideWhenUsed/>
     <w:qFormat/>
@@ -6529,10 +6303,10 @@
       <w:szCs w:val="20"/>
     </w:rPr>
   </w:style>
-  <w:style w:type="paragraph" w:styleId="a5">
+  <w:style w:type="paragraph" w:styleId="a4">
     <w:name w:val="Document Map"/>
     <w:basedOn w:val="a"/>
-    <w:link w:val="a6"/>
+    <w:link w:val="Char0"/>
     <w:uiPriority w:val="99"/>
     <w:semiHidden/>
     <w:unhideWhenUsed/>
@@ -6543,10 +6317,10 @@
       <w:szCs w:val="18"/>
     </w:rPr>
   </w:style>
-  <w:style w:type="paragraph" w:styleId="a7">
+  <w:style w:type="paragraph" w:styleId="a5">
     <w:name w:val="annotation text"/>
     <w:basedOn w:val="a"/>
-    <w:link w:val="a8"/>
+    <w:link w:val="Char1"/>
     <w:uiPriority w:val="99"/>
     <w:unhideWhenUsed/>
     <w:qFormat/>
@@ -6554,10 +6328,10 @@
       <w:jc w:val="left"/>
     </w:pPr>
   </w:style>
-  <w:style w:type="paragraph" w:styleId="a9">
+  <w:style w:type="paragraph" w:styleId="a6">
     <w:name w:val="Body Text"/>
     <w:basedOn w:val="a"/>
-    <w:link w:val="aa"/>
+    <w:link w:val="Char2"/>
     <w:uiPriority w:val="99"/>
     <w:unhideWhenUsed/>
     <w:qFormat/>
@@ -6565,7 +6339,7 @@
       <w:spacing w:after="120"/>
     </w:pPr>
   </w:style>
-  <w:style w:type="paragraph" w:styleId="31">
+  <w:style w:type="paragraph" w:styleId="30">
     <w:name w:val="toc 3"/>
     <w:basedOn w:val="a"/>
     <w:next w:val="a"/>
@@ -6581,11 +6355,11 @@
       <w:sz w:val="24"/>
     </w:rPr>
   </w:style>
-  <w:style w:type="paragraph" w:styleId="ab">
+  <w:style w:type="paragraph" w:styleId="a7">
     <w:name w:val="Date"/>
     <w:basedOn w:val="a"/>
     <w:next w:val="a"/>
-    <w:link w:val="ac"/>
+    <w:link w:val="Char3"/>
     <w:uiPriority w:val="99"/>
     <w:semiHidden/>
     <w:unhideWhenUsed/>
@@ -6594,10 +6368,10 @@
       <w:ind w:leftChars="2500" w:left="100"/>
     </w:pPr>
   </w:style>
-  <w:style w:type="paragraph" w:styleId="ad">
+  <w:style w:type="paragraph" w:styleId="a8">
     <w:name w:val="Balloon Text"/>
     <w:basedOn w:val="a"/>
-    <w:link w:val="ae"/>
+    <w:link w:val="Char4"/>
     <w:uiPriority w:val="99"/>
     <w:semiHidden/>
     <w:unhideWhenUsed/>
@@ -6607,10 +6381,10 @@
       <w:szCs w:val="18"/>
     </w:rPr>
   </w:style>
-  <w:style w:type="paragraph" w:styleId="af">
+  <w:style w:type="paragraph" w:styleId="a9">
     <w:name w:val="footer"/>
     <w:basedOn w:val="a"/>
-    <w:link w:val="af0"/>
+    <w:link w:val="Char5"/>
     <w:uiPriority w:val="99"/>
     <w:unhideWhenUsed/>
     <w:qFormat/>
@@ -6627,10 +6401,10 @@
       <w:szCs w:val="18"/>
     </w:rPr>
   </w:style>
-  <w:style w:type="paragraph" w:styleId="af1">
+  <w:style w:type="paragraph" w:styleId="aa">
     <w:name w:val="header"/>
     <w:basedOn w:val="a"/>
-    <w:link w:val="af2"/>
+    <w:link w:val="Char6"/>
     <w:uiPriority w:val="99"/>
     <w:unhideWhenUsed/>
     <w:qFormat/>
@@ -6650,7 +6424,7 @@
       <w:szCs w:val="18"/>
     </w:rPr>
   </w:style>
-  <w:style w:type="paragraph" w:styleId="11">
+  <w:style w:type="paragraph" w:styleId="10">
     <w:name w:val="toc 1"/>
     <w:basedOn w:val="a"/>
     <w:next w:val="a"/>
@@ -6663,11 +6437,11 @@
       <w:sz w:val="24"/>
     </w:rPr>
   </w:style>
-  <w:style w:type="paragraph" w:styleId="af3">
+  <w:style w:type="paragraph" w:styleId="ab">
     <w:name w:val="Subtitle"/>
     <w:basedOn w:val="a"/>
     <w:next w:val="a"/>
-    <w:link w:val="af4"/>
+    <w:link w:val="Char7"/>
     <w:uiPriority w:val="11"/>
     <w:qFormat/>
     <w:pPr>
@@ -6684,7 +6458,7 @@
       <w:szCs w:val="32"/>
     </w:rPr>
   </w:style>
-  <w:style w:type="paragraph" w:styleId="21">
+  <w:style w:type="paragraph" w:styleId="20">
     <w:name w:val="toc 2"/>
     <w:basedOn w:val="a"/>
     <w:next w:val="a"/>
@@ -6700,11 +6474,11 @@
       <w:sz w:val="24"/>
     </w:rPr>
   </w:style>
-  <w:style w:type="paragraph" w:styleId="af5">
+  <w:style w:type="paragraph" w:styleId="ac">
     <w:name w:val="Title"/>
     <w:basedOn w:val="a"/>
     <w:next w:val="a"/>
-    <w:link w:val="af6"/>
+    <w:link w:val="Char8"/>
     <w:qFormat/>
     <w:pPr>
       <w:spacing w:before="240" w:after="60"/>
@@ -6719,11 +6493,11 @@
       <w:szCs w:val="32"/>
     </w:rPr>
   </w:style>
-  <w:style w:type="paragraph" w:styleId="af7">
+  <w:style w:type="paragraph" w:styleId="ad">
     <w:name w:val="annotation subject"/>
-    <w:basedOn w:val="a7"/>
-    <w:next w:val="a7"/>
-    <w:link w:val="af8"/>
+    <w:basedOn w:val="a5"/>
+    <w:next w:val="a5"/>
+    <w:link w:val="Char9"/>
     <w:uiPriority w:val="99"/>
     <w:semiHidden/>
     <w:unhideWhenUsed/>
@@ -6739,7 +6513,7 @@
       <w:sz w:val="24"/>
     </w:rPr>
   </w:style>
-  <w:style w:type="table" w:styleId="af9">
+  <w:style w:type="table" w:styleId="ae">
     <w:name w:val="Table Grid"/>
     <w:basedOn w:val="a1"/>
     <w:uiPriority w:val="59"/>
@@ -6747,6 +6521,7 @@
     <w:unhideWhenUsed/>
     <w:qFormat/>
     <w:tblPr>
+      <w:tblInd w:w="0" w:type="dxa"/>
       <w:tblBorders>
         <w:top w:val="single" w:sz="4" w:space="0" w:color="auto"/>
         <w:left w:val="single" w:sz="4" w:space="0" w:color="auto"/>
@@ -6755,9 +6530,15 @@
         <w:insideH w:val="single" w:sz="4" w:space="0" w:color="auto"/>
         <w:insideV w:val="single" w:sz="4" w:space="0" w:color="auto"/>
       </w:tblBorders>
+      <w:tblCellMar>
+        <w:top w:w="0" w:type="dxa"/>
+        <w:left w:w="108" w:type="dxa"/>
+        <w:bottom w:w="0" w:type="dxa"/>
+        <w:right w:w="108" w:type="dxa"/>
+      </w:tblCellMar>
     </w:tblPr>
   </w:style>
-  <w:style w:type="character" w:styleId="afa">
+  <w:style w:type="character" w:styleId="af">
     <w:name w:val="annotation reference"/>
     <w:basedOn w:val="a0"/>
     <w:unhideWhenUsed/>
@@ -6790,8 +6571,8 @@
       <w:szCs w:val="20"/>
     </w:rPr>
   </w:style>
-  <w:style w:type="character" w:customStyle="1" w:styleId="20">
-    <w:name w:val="标题 2 字符"/>
+  <w:style w:type="character" w:customStyle="1" w:styleId="2Char">
+    <w:name w:val="标题 2 Char"/>
     <w:basedOn w:val="a0"/>
     <w:link w:val="2"/>
     <w:uiPriority w:val="9"/>
@@ -6804,8 +6585,8 @@
       <w:szCs w:val="32"/>
     </w:rPr>
   </w:style>
-  <w:style w:type="character" w:customStyle="1" w:styleId="60">
-    <w:name w:val="标题 6 字符"/>
+  <w:style w:type="character" w:customStyle="1" w:styleId="6Char">
+    <w:name w:val="标题 6 Char"/>
     <w:basedOn w:val="a0"/>
     <w:link w:val="6"/>
     <w:uiPriority w:val="9"/>
@@ -6818,10 +6599,10 @@
       <w:szCs w:val="24"/>
     </w:rPr>
   </w:style>
-  <w:style w:type="character" w:customStyle="1" w:styleId="af2">
-    <w:name w:val="页眉 字符"/>
+  <w:style w:type="character" w:customStyle="1" w:styleId="Char6">
+    <w:name w:val="页眉 Char"/>
     <w:basedOn w:val="a0"/>
-    <w:link w:val="af1"/>
+    <w:link w:val="aa"/>
     <w:uiPriority w:val="99"/>
     <w:qFormat/>
     <w:rPr>
@@ -6830,10 +6611,10 @@
       <w:szCs w:val="18"/>
     </w:rPr>
   </w:style>
-  <w:style w:type="character" w:customStyle="1" w:styleId="af0">
-    <w:name w:val="页脚 字符"/>
+  <w:style w:type="character" w:customStyle="1" w:styleId="Char5">
+    <w:name w:val="页脚 Char"/>
     <w:basedOn w:val="a0"/>
-    <w:link w:val="af"/>
+    <w:link w:val="a9"/>
     <w:uiPriority w:val="99"/>
     <w:qFormat/>
     <w:rPr>
@@ -6842,10 +6623,10 @@
       <w:szCs w:val="18"/>
     </w:rPr>
   </w:style>
-  <w:style w:type="paragraph" w:customStyle="1" w:styleId="afb">
+  <w:style w:type="paragraph" w:customStyle="1" w:styleId="af0">
     <w:name w:val="样式 四号 加粗 居中"/>
-    <w:basedOn w:val="a9"/>
-    <w:next w:val="a9"/>
+    <w:basedOn w:val="a6"/>
+    <w:next w:val="a6"/>
     <w:qFormat/>
     <w:pPr>
       <w:spacing w:after="0"/>
@@ -6859,10 +6640,10 @@
       <w:szCs w:val="20"/>
     </w:rPr>
   </w:style>
-  <w:style w:type="character" w:customStyle="1" w:styleId="aa">
-    <w:name w:val="正文文本 字符"/>
+  <w:style w:type="character" w:customStyle="1" w:styleId="Char2">
+    <w:name w:val="正文文本 Char"/>
     <w:basedOn w:val="a0"/>
-    <w:link w:val="a9"/>
+    <w:link w:val="a6"/>
     <w:uiPriority w:val="99"/>
     <w:qFormat/>
     <w:rPr>
@@ -6870,8 +6651,8 @@
       <w:sz w:val="24"/>
     </w:rPr>
   </w:style>
-  <w:style w:type="character" w:customStyle="1" w:styleId="a4">
-    <w:name w:val="题注 字符"/>
+  <w:style w:type="character" w:customStyle="1" w:styleId="Char">
+    <w:name w:val="题注 Char"/>
     <w:basedOn w:val="a0"/>
     <w:link w:val="a3"/>
     <w:uiPriority w:val="35"/>
@@ -6913,17 +6694,17 @@
       <w:szCs w:val="24"/>
     </w:rPr>
   </w:style>
-  <w:style w:type="character" w:customStyle="1" w:styleId="a8">
-    <w:name w:val="批注文字 字符"/>
+  <w:style w:type="character" w:customStyle="1" w:styleId="Char1">
+    <w:name w:val="批注文字 Char"/>
     <w:basedOn w:val="a0"/>
-    <w:link w:val="a7"/>
+    <w:link w:val="a5"/>
     <w:uiPriority w:val="99"/>
     <w:qFormat/>
   </w:style>
-  <w:style w:type="character" w:customStyle="1" w:styleId="ae">
-    <w:name w:val="批注框文本 字符"/>
+  <w:style w:type="character" w:customStyle="1" w:styleId="Char4">
+    <w:name w:val="批注框文本 Char"/>
     <w:basedOn w:val="a0"/>
-    <w:link w:val="ad"/>
+    <w:link w:val="a8"/>
     <w:uiPriority w:val="99"/>
     <w:semiHidden/>
     <w:qFormat/>
@@ -6933,10 +6714,10 @@
       <w:szCs w:val="18"/>
     </w:rPr>
   </w:style>
-  <w:style w:type="character" w:customStyle="1" w:styleId="af8">
-    <w:name w:val="批注主题 字符"/>
-    <w:basedOn w:val="a8"/>
-    <w:link w:val="af7"/>
+  <w:style w:type="character" w:customStyle="1" w:styleId="Char9">
+    <w:name w:val="批注主题 Char"/>
+    <w:basedOn w:val="Char1"/>
+    <w:link w:val="ad"/>
     <w:uiPriority w:val="99"/>
     <w:semiHidden/>
     <w:qFormat/>
@@ -6973,7 +6754,7 @@
   </w:style>
   <w:style w:type="paragraph" w:customStyle="1" w:styleId="RC0">
     <w:name w:val="RC标题"/>
-    <w:basedOn w:val="af5"/>
+    <w:basedOn w:val="ac"/>
     <w:link w:val="RCChar0"/>
     <w:qFormat/>
     <w:pPr>
@@ -6986,7 +6767,7 @@
   </w:style>
   <w:style w:type="character" w:customStyle="1" w:styleId="RCChar0">
     <w:name w:val="RC标题 Char"/>
-    <w:basedOn w:val="af6"/>
+    <w:basedOn w:val="Char8"/>
     <w:link w:val="RC0"/>
     <w:qFormat/>
     <w:rPr>
@@ -6997,10 +6778,10 @@
       <w:szCs w:val="32"/>
     </w:rPr>
   </w:style>
-  <w:style w:type="character" w:customStyle="1" w:styleId="af6">
-    <w:name w:val="标题 字符"/>
+  <w:style w:type="character" w:customStyle="1" w:styleId="Char8">
+    <w:name w:val="标题 Char"/>
     <w:basedOn w:val="a0"/>
-    <w:link w:val="af5"/>
+    <w:link w:val="ac"/>
     <w:qFormat/>
     <w:rPr>
       <w:rFonts w:asciiTheme="majorHAnsi" w:eastAsia="宋体" w:hAnsiTheme="majorHAnsi" w:cstheme="majorBidi"/>
@@ -7027,7 +6808,7 @@
   </w:style>
   <w:style w:type="character" w:customStyle="1" w:styleId="RCChar1">
     <w:name w:val="RC题注 Char"/>
-    <w:basedOn w:val="a4"/>
+    <w:basedOn w:val="Char"/>
     <w:link w:val="RC1"/>
     <w:qFormat/>
     <w:rPr>
@@ -7036,8 +6817,8 @@
       <w:szCs w:val="21"/>
     </w:rPr>
   </w:style>
-  <w:style w:type="character" w:customStyle="1" w:styleId="10">
-    <w:name w:val="标题 1 字符"/>
+  <w:style w:type="character" w:customStyle="1" w:styleId="1Char">
+    <w:name w:val="标题 1 Char"/>
     <w:basedOn w:val="a0"/>
     <w:link w:val="1"/>
     <w:uiPriority w:val="9"/>
@@ -7051,8 +6832,8 @@
       <w:szCs w:val="44"/>
     </w:rPr>
   </w:style>
-  <w:style w:type="character" w:customStyle="1" w:styleId="30">
-    <w:name w:val="标题 3 字符"/>
+  <w:style w:type="character" w:customStyle="1" w:styleId="3Char">
+    <w:name w:val="标题 3 Char"/>
     <w:basedOn w:val="a0"/>
     <w:link w:val="3"/>
     <w:uiPriority w:val="9"/>
@@ -7066,8 +6847,8 @@
       <w:szCs w:val="32"/>
     </w:rPr>
   </w:style>
-  <w:style w:type="character" w:customStyle="1" w:styleId="40">
-    <w:name w:val="标题 4 字符"/>
+  <w:style w:type="character" w:customStyle="1" w:styleId="4Char">
+    <w:name w:val="标题 4 Char"/>
     <w:basedOn w:val="a0"/>
     <w:link w:val="4"/>
     <w:uiPriority w:val="9"/>
@@ -7081,8 +6862,8 @@
       <w:szCs w:val="28"/>
     </w:rPr>
   </w:style>
-  <w:style w:type="character" w:customStyle="1" w:styleId="50">
-    <w:name w:val="标题 5 字符"/>
+  <w:style w:type="character" w:customStyle="1" w:styleId="5Char">
+    <w:name w:val="标题 5 Char"/>
     <w:basedOn w:val="a0"/>
     <w:link w:val="5"/>
     <w:uiPriority w:val="9"/>
@@ -7096,8 +6877,8 @@
       <w:szCs w:val="28"/>
     </w:rPr>
   </w:style>
-  <w:style w:type="character" w:customStyle="1" w:styleId="70">
-    <w:name w:val="标题 7 字符"/>
+  <w:style w:type="character" w:customStyle="1" w:styleId="7Char">
+    <w:name w:val="标题 7 Char"/>
     <w:basedOn w:val="a0"/>
     <w:link w:val="7"/>
     <w:uiPriority w:val="9"/>
@@ -7110,8 +6891,8 @@
       <w:szCs w:val="24"/>
     </w:rPr>
   </w:style>
-  <w:style w:type="character" w:customStyle="1" w:styleId="80">
-    <w:name w:val="标题 8 字符"/>
+  <w:style w:type="character" w:customStyle="1" w:styleId="8Char">
+    <w:name w:val="标题 8 Char"/>
     <w:basedOn w:val="a0"/>
     <w:link w:val="8"/>
     <w:uiPriority w:val="9"/>
@@ -7123,8 +6904,8 @@
       <w:szCs w:val="24"/>
     </w:rPr>
   </w:style>
-  <w:style w:type="character" w:customStyle="1" w:styleId="90">
-    <w:name w:val="标题 9 字符"/>
+  <w:style w:type="character" w:customStyle="1" w:styleId="9Char">
+    <w:name w:val="标题 9 Char"/>
     <w:basedOn w:val="a0"/>
     <w:link w:val="9"/>
     <w:uiPriority w:val="9"/>
@@ -7135,10 +6916,10 @@
       <w:szCs w:val="21"/>
     </w:rPr>
   </w:style>
-  <w:style w:type="character" w:customStyle="1" w:styleId="af4">
-    <w:name w:val="副标题 字符"/>
+  <w:style w:type="character" w:customStyle="1" w:styleId="Char7">
+    <w:name w:val="副标题 Char"/>
     <w:basedOn w:val="a0"/>
-    <w:link w:val="af3"/>
+    <w:link w:val="ab"/>
     <w:uiPriority w:val="11"/>
     <w:qFormat/>
     <w:rPr>
@@ -7150,7 +6931,7 @@
       <w:szCs w:val="32"/>
     </w:rPr>
   </w:style>
-  <w:style w:type="paragraph" w:styleId="afc">
+  <w:style w:type="paragraph" w:styleId="af1">
     <w:name w:val="List Paragraph"/>
     <w:basedOn w:val="a"/>
     <w:uiPriority w:val="34"/>
@@ -7190,6 +6971,7 @@
       <w:jc w:val="center"/>
     </w:pPr>
     <w:tblPr>
+      <w:tblInd w:w="0" w:type="dxa"/>
       <w:tblBorders>
         <w:top w:val="single" w:sz="12" w:space="0" w:color="auto"/>
         <w:left w:val="single" w:sz="12" w:space="0" w:color="auto"/>
@@ -7198,24 +6980,1171 @@
         <w:insideH w:val="single" w:sz="4" w:space="0" w:color="auto"/>
         <w:insideV w:val="single" w:sz="4" w:space="0" w:color="auto"/>
       </w:tblBorders>
+      <w:tblCellMar>
+        <w:top w:w="0" w:type="dxa"/>
+        <w:left w:w="108" w:type="dxa"/>
+        <w:bottom w:w="0" w:type="dxa"/>
+        <w:right w:w="108" w:type="dxa"/>
+      </w:tblCellMar>
     </w:tblPr>
     <w:tcPr>
       <w:vAlign w:val="center"/>
     </w:tcPr>
   </w:style>
-  <w:style w:type="character" w:customStyle="1" w:styleId="ac">
-    <w:name w:val="日期 字符"/>
+  <w:style w:type="character" w:customStyle="1" w:styleId="Char3">
+    <w:name w:val="日期 Char"/>
     <w:basedOn w:val="a0"/>
-    <w:link w:val="ab"/>
+    <w:link w:val="a7"/>
     <w:uiPriority w:val="99"/>
     <w:semiHidden/>
     <w:qFormat/>
   </w:style>
-  <w:style w:type="character" w:customStyle="1" w:styleId="a6">
-    <w:name w:val="文档结构图 字符"/>
+  <w:style w:type="character" w:customStyle="1" w:styleId="Char0">
+    <w:name w:val="文档结构图 Char"/>
+    <w:basedOn w:val="a0"/>
+    <w:link w:val="a4"/>
+    <w:uiPriority w:val="99"/>
+    <w:semiHidden/>
+    <w:qFormat/>
+    <w:rPr>
+      <w:rFonts w:ascii="宋体" w:eastAsia="宋体"/>
+      <w:sz w:val="18"/>
+      <w:szCs w:val="18"/>
+    </w:rPr>
+  </w:style>
+  <w:style w:type="paragraph" w:styleId="af2">
+    <w:name w:val="No Spacing"/>
+    <w:uiPriority w:val="1"/>
+    <w:qFormat/>
+    <w:pPr>
+      <w:widowControl w:val="0"/>
+      <w:jc w:val="both"/>
+    </w:pPr>
+    <w:rPr>
+      <w:rFonts w:asciiTheme="minorHAnsi" w:eastAsiaTheme="minorEastAsia" w:hAnsiTheme="minorHAnsi" w:cstheme="minorBidi"/>
+      <w:kern w:val="2"/>
+      <w:sz w:val="21"/>
+      <w:szCs w:val="22"/>
+    </w:rPr>
+  </w:style>
+</w:styles>
+</file>
+
+<file path=word/stylesWithEffects.xml><?xml version="1.0" encoding="utf-8"?>
+<w:styles xmlns:wpc="http://schemas.microsoft.com/office/word/2010/wordprocessingCanvas" xmlns:mc="http://schemas.openxmlformats.org/markup-compatibility/2006" xmlns:o="urn:schemas-microsoft-com:office:office" xmlns:r="http://schemas.openxmlformats.org/officeDocument/2006/relationships" xmlns:m="http://schemas.openxmlformats.org/officeDocument/2006/math" xmlns:v="urn:schemas-microsoft-com:vml" xmlns:wp14="http://schemas.microsoft.com/office/word/2010/wordprocessingDrawing" xmlns:wp="http://schemas.openxmlformats.org/drawingml/2006/wordprocessingDrawing" xmlns:w10="urn:schemas-microsoft-com:office:word" xmlns:w="http://schemas.openxmlformats.org/wordprocessingml/2006/main" xmlns:w14="http://schemas.microsoft.com/office/word/2010/wordml" xmlns:wpg="http://schemas.microsoft.com/office/word/2010/wordprocessingGroup" xmlns:wpi="http://schemas.microsoft.com/office/word/2010/wordprocessingInk" xmlns:wne="http://schemas.microsoft.com/office/word/2006/wordml" xmlns:wps="http://schemas.microsoft.com/office/word/2010/wordprocessingShape" mc:Ignorable="w14 wp14">
+  <w:docDefaults>
+    <w:rPrDefault>
+      <w:rPr>
+        <w:rFonts w:ascii="Times New Roman" w:eastAsia="宋体" w:hAnsi="Times New Roman" w:cs="Times New Roman"/>
+        <w:lang w:val="en-US" w:eastAsia="zh-CN" w:bidi="ar-SA"/>
+      </w:rPr>
+    </w:rPrDefault>
+    <w:pPrDefault/>
+  </w:docDefaults>
+  <w:latentStyles w:defLockedState="0" w:defUIPriority="99" w:defSemiHidden="1" w:defUnhideWhenUsed="1" w:defQFormat="0" w:count="267">
+    <w:lsdException w:name="Normal" w:semiHidden="0" w:uiPriority="0" w:unhideWhenUsed="0" w:qFormat="1"/>
+    <w:lsdException w:name="heading 1" w:semiHidden="0" w:uiPriority="9" w:unhideWhenUsed="0" w:qFormat="1"/>
+    <w:lsdException w:name="heading 2" w:semiHidden="0" w:uiPriority="9" w:qFormat="1"/>
+    <w:lsdException w:name="heading 3" w:uiPriority="9" w:qFormat="1"/>
+    <w:lsdException w:name="heading 4" w:uiPriority="9" w:qFormat="1"/>
+    <w:lsdException w:name="heading 5" w:uiPriority="9" w:qFormat="1"/>
+    <w:lsdException w:name="heading 6" w:semiHidden="0" w:uiPriority="9" w:qFormat="1"/>
+    <w:lsdException w:name="heading 7" w:uiPriority="9" w:qFormat="1"/>
+    <w:lsdException w:name="heading 8" w:uiPriority="9" w:qFormat="1"/>
+    <w:lsdException w:name="heading 9" w:uiPriority="9" w:qFormat="1"/>
+    <w:lsdException w:name="toc 1" w:uiPriority="39" w:qFormat="1"/>
+    <w:lsdException w:name="toc 2" w:uiPriority="39" w:qFormat="1"/>
+    <w:lsdException w:name="toc 3" w:uiPriority="39" w:qFormat="1"/>
+    <w:lsdException w:name="toc 4" w:uiPriority="39"/>
+    <w:lsdException w:name="toc 5" w:uiPriority="39"/>
+    <w:lsdException w:name="toc 6" w:uiPriority="39"/>
+    <w:lsdException w:name="toc 7" w:uiPriority="39"/>
+    <w:lsdException w:name="toc 8" w:uiPriority="39"/>
+    <w:lsdException w:name="toc 9" w:uiPriority="39"/>
+    <w:lsdException w:name="annotation text" w:semiHidden="0" w:qFormat="1"/>
+    <w:lsdException w:name="header" w:semiHidden="0" w:qFormat="1"/>
+    <w:lsdException w:name="footer" w:semiHidden="0" w:qFormat="1"/>
+    <w:lsdException w:name="caption" w:semiHidden="0" w:uiPriority="35" w:qFormat="1"/>
+    <w:lsdException w:name="annotation reference" w:semiHidden="0" w:uiPriority="0" w:qFormat="1"/>
+    <w:lsdException w:name="Title" w:semiHidden="0" w:uiPriority="0" w:unhideWhenUsed="0" w:qFormat="1"/>
+    <w:lsdException w:name="Default Paragraph Font" w:uiPriority="1" w:qFormat="1"/>
+    <w:lsdException w:name="Body Text" w:qFormat="1"/>
+    <w:lsdException w:name="Subtitle" w:semiHidden="0" w:uiPriority="11" w:unhideWhenUsed="0" w:qFormat="1"/>
+    <w:lsdException w:name="Date" w:qFormat="1"/>
+    <w:lsdException w:name="Strong" w:semiHidden="0" w:uiPriority="22" w:unhideWhenUsed="0" w:qFormat="1"/>
+    <w:lsdException w:name="Emphasis" w:semiHidden="0" w:uiPriority="20" w:unhideWhenUsed="0" w:qFormat="1"/>
+    <w:lsdException w:name="Document Map" w:qFormat="1"/>
+    <w:lsdException w:name="annotation subject" w:qFormat="1"/>
+    <w:lsdException w:name="Balloon Text" w:qFormat="1"/>
+    <w:lsdException w:name="Table Grid" w:semiHidden="0" w:uiPriority="59" w:unhideWhenUsed="0" w:qFormat="1"/>
+    <w:lsdException w:name="Placeholder Text" w:unhideWhenUsed="0"/>
+    <w:lsdException w:name="No Spacing" w:semiHidden="0" w:uiPriority="1" w:unhideWhenUsed="0" w:qFormat="1"/>
+    <w:lsdException w:name="Light Shading" w:semiHidden="0" w:uiPriority="60" w:unhideWhenUsed="0"/>
+    <w:lsdException w:name="Light List" w:semiHidden="0" w:uiPriority="61" w:unhideWhenUsed="0"/>
+    <w:lsdException w:name="Light Grid" w:semiHidden="0" w:uiPriority="62" w:unhideWhenUsed="0"/>
+    <w:lsdException w:name="Medium Shading 1" w:semiHidden="0" w:uiPriority="63" w:unhideWhenUsed="0"/>
+    <w:lsdException w:name="Medium Shading 2" w:semiHidden="0" w:uiPriority="64" w:unhideWhenUsed="0"/>
+    <w:lsdException w:name="Medium List 1" w:semiHidden="0" w:uiPriority="65" w:unhideWhenUsed="0"/>
+    <w:lsdException w:name="Medium List 2" w:semiHidden="0" w:uiPriority="66" w:unhideWhenUsed="0"/>
+    <w:lsdException w:name="Medium Grid 1" w:semiHidden="0" w:uiPriority="67" w:unhideWhenUsed="0"/>
+    <w:lsdException w:name="Medium Grid 2" w:semiHidden="0" w:uiPriority="68" w:unhideWhenUsed="0"/>
+    <w:lsdException w:name="Medium Grid 3" w:semiHidden="0" w:uiPriority="69" w:unhideWhenUsed="0"/>
+    <w:lsdException w:name="Dark List" w:semiHidden="0" w:uiPriority="70" w:unhideWhenUsed="0"/>
+    <w:lsdException w:name="Colorful Shading" w:semiHidden="0" w:uiPriority="71" w:unhideWhenUsed="0"/>
+    <w:lsdException w:name="Colorful List" w:semiHidden="0" w:uiPriority="72" w:unhideWhenUsed="0"/>
+    <w:lsdException w:name="Colorful Grid" w:semiHidden="0" w:uiPriority="73" w:unhideWhenUsed="0"/>
+    <w:lsdException w:name="Light Shading Accent 1" w:semiHidden="0" w:uiPriority="60" w:unhideWhenUsed="0"/>
+    <w:lsdException w:name="Light List Accent 1" w:semiHidden="0" w:uiPriority="61" w:unhideWhenUsed="0"/>
+    <w:lsdException w:name="Light Grid Accent 1" w:semiHidden="0" w:uiPriority="62" w:unhideWhenUsed="0"/>
+    <w:lsdException w:name="Medium Shading 1 Accent 1" w:semiHidden="0" w:uiPriority="63" w:unhideWhenUsed="0"/>
+    <w:lsdException w:name="Medium Shading 2 Accent 1" w:semiHidden="0" w:uiPriority="64" w:unhideWhenUsed="0"/>
+    <w:lsdException w:name="Medium List 1 Accent 1" w:semiHidden="0" w:uiPriority="65" w:unhideWhenUsed="0"/>
+    <w:lsdException w:name="Revision" w:unhideWhenUsed="0"/>
+    <w:lsdException w:name="List Paragraph" w:semiHidden="0" w:uiPriority="34" w:unhideWhenUsed="0" w:qFormat="1"/>
+    <w:lsdException w:name="Quote" w:semiHidden="0" w:unhideWhenUsed="0"/>
+    <w:lsdException w:name="Intense Quote" w:semiHidden="0" w:unhideWhenUsed="0"/>
+    <w:lsdException w:name="Medium List 2 Accent 1" w:semiHidden="0" w:uiPriority="66" w:unhideWhenUsed="0"/>
+    <w:lsdException w:name="Medium Grid 1 Accent 1" w:semiHidden="0" w:uiPriority="67" w:unhideWhenUsed="0"/>
+    <w:lsdException w:name="Medium Grid 2 Accent 1" w:semiHidden="0" w:uiPriority="68" w:unhideWhenUsed="0"/>
+    <w:lsdException w:name="Medium Grid 3 Accent 1" w:semiHidden="0" w:uiPriority="69" w:unhideWhenUsed="0"/>
+    <w:lsdException w:name="Dark List Accent 1" w:semiHidden="0" w:uiPriority="70" w:unhideWhenUsed="0"/>
+    <w:lsdException w:name="Colorful Shading Accent 1" w:semiHidden="0" w:uiPriority="71" w:unhideWhenUsed="0"/>
+    <w:lsdException w:name="Colorful List Accent 1" w:semiHidden="0" w:uiPriority="72" w:unhideWhenUsed="0"/>
+    <w:lsdException w:name="Colorful Grid Accent 1" w:semiHidden="0" w:uiPriority="73" w:unhideWhenUsed="0"/>
+    <w:lsdException w:name="Light Shading Accent 2" w:semiHidden="0" w:uiPriority="60" w:unhideWhenUsed="0"/>
+    <w:lsdException w:name="Light List Accent 2" w:semiHidden="0" w:uiPriority="61" w:unhideWhenUsed="0"/>
+    <w:lsdException w:name="Light Grid Accent 2" w:semiHidden="0" w:uiPriority="62" w:unhideWhenUsed="0"/>
+    <w:lsdException w:name="Medium Shading 1 Accent 2" w:semiHidden="0" w:uiPriority="63" w:unhideWhenUsed="0"/>
+    <w:lsdException w:name="Medium Shading 2 Accent 2" w:semiHidden="0" w:uiPriority="64" w:unhideWhenUsed="0"/>
+    <w:lsdException w:name="Medium List 1 Accent 2" w:semiHidden="0" w:uiPriority="65" w:unhideWhenUsed="0"/>
+    <w:lsdException w:name="Medium List 2 Accent 2" w:semiHidden="0" w:uiPriority="66" w:unhideWhenUsed="0"/>
+    <w:lsdException w:name="Medium Grid 1 Accent 2" w:semiHidden="0" w:uiPriority="67" w:unhideWhenUsed="0"/>
+    <w:lsdException w:name="Medium Grid 2 Accent 2" w:semiHidden="0" w:uiPriority="68" w:unhideWhenUsed="0"/>
+    <w:lsdException w:name="Medium Grid 3 Accent 2" w:semiHidden="0" w:uiPriority="69" w:unhideWhenUsed="0"/>
+    <w:lsdException w:name="Dark List Accent 2" w:semiHidden="0" w:uiPriority="70" w:unhideWhenUsed="0"/>
+    <w:lsdException w:name="Colorful Shading Accent 2" w:semiHidden="0" w:uiPriority="71" w:unhideWhenUsed="0"/>
+    <w:lsdException w:name="Colorful List Accent 2" w:semiHidden="0" w:uiPriority="72" w:unhideWhenUsed="0"/>
+    <w:lsdException w:name="Colorful Grid Accent 2" w:semiHidden="0" w:uiPriority="73" w:unhideWhenUsed="0"/>
+    <w:lsdException w:name="Light Shading Accent 3" w:semiHidden="0" w:uiPriority="60" w:unhideWhenUsed="0"/>
+    <w:lsdException w:name="Light List Accent 3" w:semiHidden="0" w:uiPriority="61" w:unhideWhenUsed="0"/>
+    <w:lsdException w:name="Light Grid Accent 3" w:semiHidden="0" w:uiPriority="62" w:unhideWhenUsed="0"/>
+    <w:lsdException w:name="Medium Shading 1 Accent 3" w:semiHidden="0" w:uiPriority="63" w:unhideWhenUsed="0"/>
+    <w:lsdException w:name="Medium Shading 2 Accent 3" w:semiHidden="0" w:uiPriority="64" w:unhideWhenUsed="0"/>
+    <w:lsdException w:name="Medium List 1 Accent 3" w:semiHidden="0" w:uiPriority="65" w:unhideWhenUsed="0"/>
+    <w:lsdException w:name="Medium List 2 Accent 3" w:semiHidden="0" w:uiPriority="66" w:unhideWhenUsed="0"/>
+    <w:lsdException w:name="Medium Grid 1 Accent 3" w:semiHidden="0" w:uiPriority="67" w:unhideWhenUsed="0"/>
+    <w:lsdException w:name="Medium Grid 2 Accent 3" w:semiHidden="0" w:uiPriority="68" w:unhideWhenUsed="0"/>
+    <w:lsdException w:name="Medium Grid 3 Accent 3" w:semiHidden="0" w:uiPriority="69" w:unhideWhenUsed="0"/>
+    <w:lsdException w:name="Dark List Accent 3" w:semiHidden="0" w:uiPriority="70" w:unhideWhenUsed="0"/>
+    <w:lsdException w:name="Colorful Shading Accent 3" w:semiHidden="0" w:uiPriority="71" w:unhideWhenUsed="0"/>
+    <w:lsdException w:name="Colorful List Accent 3" w:semiHidden="0" w:uiPriority="72" w:unhideWhenUsed="0"/>
+    <w:lsdException w:name="Colorful Grid Accent 3" w:semiHidden="0" w:uiPriority="73" w:unhideWhenUsed="0"/>
+    <w:lsdException w:name="Light Shading Accent 4" w:semiHidden="0" w:uiPriority="60" w:unhideWhenUsed="0"/>
+    <w:lsdException w:name="Light List Accent 4" w:semiHidden="0" w:uiPriority="61" w:unhideWhenUsed="0"/>
+    <w:lsdException w:name="Light Grid Accent 4" w:semiHidden="0" w:uiPriority="62" w:unhideWhenUsed="0"/>
+    <w:lsdException w:name="Medium Shading 1 Accent 4" w:semiHidden="0" w:uiPriority="63" w:unhideWhenUsed="0"/>
+    <w:lsdException w:name="Medium Shading 2 Accent 4" w:semiHidden="0" w:uiPriority="64" w:unhideWhenUsed="0"/>
+    <w:lsdException w:name="Medium List 1 Accent 4" w:semiHidden="0" w:uiPriority="65" w:unhideWhenUsed="0"/>
+    <w:lsdException w:name="Medium List 2 Accent 4" w:semiHidden="0" w:uiPriority="66" w:unhideWhenUsed="0"/>
+    <w:lsdException w:name="Medium Grid 1 Accent 4" w:semiHidden="0" w:uiPriority="67" w:unhideWhenUsed="0"/>
+    <w:lsdException w:name="Medium Grid 2 Accent 4" w:semiHidden="0" w:uiPriority="68" w:unhideWhenUsed="0"/>
+    <w:lsdException w:name="Medium Grid 3 Accent 4" w:semiHidden="0" w:uiPriority="69" w:unhideWhenUsed="0"/>
+    <w:lsdException w:name="Dark List Accent 4" w:semiHidden="0" w:uiPriority="70" w:unhideWhenUsed="0"/>
+    <w:lsdException w:name="Colorful Shading Accent 4" w:semiHidden="0" w:uiPriority="71" w:unhideWhenUsed="0"/>
+    <w:lsdException w:name="Colorful List Accent 4" w:semiHidden="0" w:uiPriority="72" w:unhideWhenUsed="0"/>
+    <w:lsdException w:name="Colorful Grid Accent 4" w:semiHidden="0" w:uiPriority="73" w:unhideWhenUsed="0"/>
+    <w:lsdException w:name="Light Shading Accent 5" w:semiHidden="0" w:uiPriority="60" w:unhideWhenUsed="0"/>
+    <w:lsdException w:name="Light List Accent 5" w:semiHidden="0" w:uiPriority="61" w:unhideWhenUsed="0"/>
+    <w:lsdException w:name="Light Grid Accent 5" w:semiHidden="0" w:uiPriority="62" w:unhideWhenUsed="0"/>
+    <w:lsdException w:name="Medium Shading 1 Accent 5" w:semiHidden="0" w:uiPriority="63" w:unhideWhenUsed="0"/>
+    <w:lsdException w:name="Medium Shading 2 Accent 5" w:semiHidden="0" w:uiPriority="64" w:unhideWhenUsed="0"/>
+    <w:lsdException w:name="Medium List 1 Accent 5" w:semiHidden="0" w:uiPriority="65" w:unhideWhenUsed="0"/>
+    <w:lsdException w:name="Medium List 2 Accent 5" w:semiHidden="0" w:uiPriority="66" w:unhideWhenUsed="0"/>
+    <w:lsdException w:name="Medium Grid 1 Accent 5" w:semiHidden="0" w:uiPriority="67" w:unhideWhenUsed="0"/>
+    <w:lsdException w:name="Medium Grid 2 Accent 5" w:semiHidden="0" w:uiPriority="68" w:unhideWhenUsed="0"/>
+    <w:lsdException w:name="Medium Grid 3 Accent 5" w:semiHidden="0" w:uiPriority="69" w:unhideWhenUsed="0"/>
+    <w:lsdException w:name="Dark List Accent 5" w:semiHidden="0" w:uiPriority="70" w:unhideWhenUsed="0"/>
+    <w:lsdException w:name="Colorful Shading Accent 5" w:semiHidden="0" w:uiPriority="71" w:unhideWhenUsed="0"/>
+    <w:lsdException w:name="Colorful List Accent 5" w:semiHidden="0" w:uiPriority="72" w:unhideWhenUsed="0"/>
+    <w:lsdException w:name="Colorful Grid Accent 5" w:semiHidden="0" w:uiPriority="73" w:unhideWhenUsed="0"/>
+    <w:lsdException w:name="Light Shading Accent 6" w:semiHidden="0" w:uiPriority="60" w:unhideWhenUsed="0"/>
+    <w:lsdException w:name="Light List Accent 6" w:semiHidden="0" w:uiPriority="61" w:unhideWhenUsed="0"/>
+    <w:lsdException w:name="Light Grid Accent 6" w:semiHidden="0" w:uiPriority="62" w:unhideWhenUsed="0"/>
+    <w:lsdException w:name="Medium Shading 1 Accent 6" w:semiHidden="0" w:uiPriority="63" w:unhideWhenUsed="0"/>
+    <w:lsdException w:name="Medium Shading 2 Accent 6" w:semiHidden="0" w:uiPriority="64" w:unhideWhenUsed="0"/>
+    <w:lsdException w:name="Medium List 1 Accent 6" w:semiHidden="0" w:uiPriority="65" w:unhideWhenUsed="0"/>
+    <w:lsdException w:name="Medium List 2 Accent 6" w:semiHidden="0" w:uiPriority="66" w:unhideWhenUsed="0"/>
+    <w:lsdException w:name="Medium Grid 1 Accent 6" w:semiHidden="0" w:uiPriority="67" w:unhideWhenUsed="0"/>
+    <w:lsdException w:name="Medium Grid 2 Accent 6" w:semiHidden="0" w:uiPriority="68" w:unhideWhenUsed="0"/>
+    <w:lsdException w:name="Medium Grid 3 Accent 6" w:semiHidden="0" w:uiPriority="69" w:unhideWhenUsed="0"/>
+    <w:lsdException w:name="Dark List Accent 6" w:semiHidden="0" w:uiPriority="70" w:unhideWhenUsed="0"/>
+    <w:lsdException w:name="Colorful Shading Accent 6" w:semiHidden="0" w:uiPriority="71" w:unhideWhenUsed="0"/>
+    <w:lsdException w:name="Colorful List Accent 6" w:semiHidden="0" w:uiPriority="72" w:unhideWhenUsed="0"/>
+    <w:lsdException w:name="Colorful Grid Accent 6" w:semiHidden="0" w:uiPriority="73" w:unhideWhenUsed="0"/>
+    <w:lsdException w:name="Subtle Emphasis" w:semiHidden="0" w:uiPriority="19" w:unhideWhenUsed="0" w:qFormat="1"/>
+    <w:lsdException w:name="Intense Emphasis" w:semiHidden="0" w:uiPriority="21" w:unhideWhenUsed="0" w:qFormat="1"/>
+    <w:lsdException w:name="Subtle Reference" w:semiHidden="0" w:uiPriority="31" w:unhideWhenUsed="0" w:qFormat="1"/>
+    <w:lsdException w:name="Intense Reference" w:semiHidden="0" w:uiPriority="32" w:unhideWhenUsed="0" w:qFormat="1"/>
+    <w:lsdException w:name="Book Title" w:semiHidden="0" w:uiPriority="33" w:unhideWhenUsed="0" w:qFormat="1"/>
+    <w:lsdException w:name="Bibliography" w:uiPriority="37"/>
+    <w:lsdException w:name="TOC Heading" w:uiPriority="39" w:qFormat="1"/>
+  </w:latentStyles>
+  <w:style w:type="paragraph" w:default="1" w:styleId="a">
+    <w:name w:val="Normal"/>
+    <w:qFormat/>
+    <w:pPr>
+      <w:widowControl w:val="0"/>
+      <w:jc w:val="both"/>
+    </w:pPr>
+    <w:rPr>
+      <w:rFonts w:asciiTheme="minorHAnsi" w:eastAsiaTheme="minorEastAsia" w:hAnsiTheme="minorHAnsi" w:cstheme="minorBidi"/>
+      <w:kern w:val="2"/>
+      <w:sz w:val="21"/>
+      <w:szCs w:val="22"/>
+    </w:rPr>
+  </w:style>
+  <w:style w:type="paragraph" w:styleId="1">
+    <w:name w:val="heading 1"/>
+    <w:basedOn w:val="a"/>
+    <w:next w:val="a"/>
+    <w:link w:val="1Char"/>
+    <w:uiPriority w:val="9"/>
+    <w:qFormat/>
+    <w:pPr>
+      <w:keepNext/>
+      <w:keepLines/>
+      <w:spacing w:line="360" w:lineRule="auto"/>
+      <w:outlineLvl w:val="0"/>
+    </w:pPr>
+    <w:rPr>
+      <w:rFonts w:ascii="Times New Roman" w:eastAsiaTheme="majorEastAsia" w:hAnsi="Times New Roman"/>
+      <w:b/>
+      <w:bCs/>
+      <w:kern w:val="44"/>
+      <w:sz w:val="28"/>
+      <w:szCs w:val="44"/>
+    </w:rPr>
+  </w:style>
+  <w:style w:type="paragraph" w:styleId="2">
+    <w:name w:val="heading 2"/>
+    <w:basedOn w:val="a"/>
+    <w:next w:val="a"/>
+    <w:link w:val="2Char"/>
+    <w:uiPriority w:val="9"/>
+    <w:unhideWhenUsed/>
+    <w:qFormat/>
+    <w:pPr>
+      <w:keepNext/>
+      <w:keepLines/>
+      <w:spacing w:line="360" w:lineRule="auto"/>
+      <w:outlineLvl w:val="1"/>
+    </w:pPr>
+    <w:rPr>
+      <w:rFonts w:ascii="Times New Roman" w:eastAsiaTheme="majorEastAsia" w:hAnsi="Times New Roman" w:cstheme="majorBidi"/>
+      <w:b/>
+      <w:bCs/>
+      <w:sz w:val="24"/>
+      <w:szCs w:val="32"/>
+    </w:rPr>
+  </w:style>
+  <w:style w:type="paragraph" w:styleId="3">
+    <w:name w:val="heading 3"/>
+    <w:basedOn w:val="a"/>
+    <w:next w:val="a"/>
+    <w:link w:val="3Char"/>
+    <w:uiPriority w:val="9"/>
+    <w:semiHidden/>
+    <w:unhideWhenUsed/>
+    <w:qFormat/>
+    <w:pPr>
+      <w:keepNext/>
+      <w:keepLines/>
+      <w:spacing w:line="360" w:lineRule="auto"/>
+      <w:outlineLvl w:val="2"/>
+    </w:pPr>
+    <w:rPr>
+      <w:rFonts w:ascii="Times New Roman" w:hAnsi="Times New Roman"/>
+      <w:b/>
+      <w:bCs/>
+      <w:sz w:val="24"/>
+      <w:szCs w:val="32"/>
+    </w:rPr>
+  </w:style>
+  <w:style w:type="paragraph" w:styleId="4">
+    <w:name w:val="heading 4"/>
+    <w:basedOn w:val="a"/>
+    <w:next w:val="a"/>
+    <w:link w:val="4Char"/>
+    <w:uiPriority w:val="9"/>
+    <w:semiHidden/>
+    <w:unhideWhenUsed/>
+    <w:qFormat/>
+    <w:pPr>
+      <w:keepNext/>
+      <w:keepLines/>
+      <w:spacing w:line="360" w:lineRule="auto"/>
+      <w:outlineLvl w:val="3"/>
+    </w:pPr>
+    <w:rPr>
+      <w:rFonts w:ascii="Times New Roman" w:eastAsiaTheme="majorEastAsia" w:hAnsi="Times New Roman" w:cstheme="majorBidi"/>
+      <w:b/>
+      <w:bCs/>
+      <w:sz w:val="24"/>
+      <w:szCs w:val="28"/>
+    </w:rPr>
+  </w:style>
+  <w:style w:type="paragraph" w:styleId="5">
+    <w:name w:val="heading 5"/>
+    <w:basedOn w:val="a"/>
+    <w:next w:val="a"/>
+    <w:link w:val="5Char"/>
+    <w:uiPriority w:val="9"/>
+    <w:semiHidden/>
+    <w:unhideWhenUsed/>
+    <w:qFormat/>
+    <w:pPr>
+      <w:keepNext/>
+      <w:keepLines/>
+      <w:spacing w:line="360" w:lineRule="auto"/>
+      <w:outlineLvl w:val="4"/>
+    </w:pPr>
+    <w:rPr>
+      <w:rFonts w:ascii="Times New Roman" w:hAnsi="Times New Roman"/>
+      <w:b/>
+      <w:bCs/>
+      <w:sz w:val="24"/>
+      <w:szCs w:val="28"/>
+    </w:rPr>
+  </w:style>
+  <w:style w:type="paragraph" w:styleId="6">
+    <w:name w:val="heading 6"/>
+    <w:basedOn w:val="a"/>
+    <w:next w:val="a"/>
+    <w:link w:val="6Char"/>
+    <w:uiPriority w:val="9"/>
+    <w:unhideWhenUsed/>
+    <w:qFormat/>
+    <w:pPr>
+      <w:keepNext/>
+      <w:keepLines/>
+      <w:spacing w:line="360" w:lineRule="auto"/>
+      <w:outlineLvl w:val="5"/>
+    </w:pPr>
+    <w:rPr>
+      <w:rFonts w:ascii="Times New Roman" w:eastAsiaTheme="majorEastAsia" w:hAnsi="Times New Roman" w:cstheme="majorBidi"/>
+      <w:b/>
+      <w:bCs/>
+      <w:sz w:val="24"/>
+      <w:szCs w:val="24"/>
+    </w:rPr>
+  </w:style>
+  <w:style w:type="paragraph" w:styleId="7">
+    <w:name w:val="heading 7"/>
+    <w:basedOn w:val="a"/>
+    <w:next w:val="a"/>
+    <w:link w:val="7Char"/>
+    <w:uiPriority w:val="9"/>
+    <w:semiHidden/>
+    <w:unhideWhenUsed/>
+    <w:qFormat/>
+    <w:pPr>
+      <w:keepNext/>
+      <w:keepLines/>
+      <w:spacing w:before="240" w:after="64" w:line="320" w:lineRule="auto"/>
+      <w:outlineLvl w:val="6"/>
+    </w:pPr>
+    <w:rPr>
+      <w:b/>
+      <w:bCs/>
+      <w:sz w:val="24"/>
+      <w:szCs w:val="24"/>
+    </w:rPr>
+  </w:style>
+  <w:style w:type="paragraph" w:styleId="8">
+    <w:name w:val="heading 8"/>
+    <w:basedOn w:val="a"/>
+    <w:next w:val="a"/>
+    <w:link w:val="8Char"/>
+    <w:uiPriority w:val="9"/>
+    <w:semiHidden/>
+    <w:unhideWhenUsed/>
+    <w:qFormat/>
+    <w:pPr>
+      <w:keepNext/>
+      <w:keepLines/>
+      <w:spacing w:before="240" w:after="64" w:line="320" w:lineRule="auto"/>
+      <w:ind w:left="1440" w:hanging="1440"/>
+      <w:outlineLvl w:val="7"/>
+    </w:pPr>
+    <w:rPr>
+      <w:rFonts w:asciiTheme="majorHAnsi" w:eastAsiaTheme="majorEastAsia" w:hAnsiTheme="majorHAnsi" w:cstheme="majorBidi"/>
+      <w:sz w:val="24"/>
+      <w:szCs w:val="24"/>
+    </w:rPr>
+  </w:style>
+  <w:style w:type="paragraph" w:styleId="9">
+    <w:name w:val="heading 9"/>
+    <w:basedOn w:val="a"/>
+    <w:next w:val="a"/>
+    <w:link w:val="9Char"/>
+    <w:uiPriority w:val="9"/>
+    <w:semiHidden/>
+    <w:unhideWhenUsed/>
+    <w:qFormat/>
+    <w:pPr>
+      <w:keepNext/>
+      <w:keepLines/>
+      <w:spacing w:before="240" w:after="64" w:line="320" w:lineRule="auto"/>
+      <w:ind w:left="1584" w:hanging="1584"/>
+      <w:outlineLvl w:val="8"/>
+    </w:pPr>
+    <w:rPr>
+      <w:rFonts w:asciiTheme="majorHAnsi" w:eastAsiaTheme="majorEastAsia" w:hAnsiTheme="majorHAnsi" w:cstheme="majorBidi"/>
+      <w:szCs w:val="21"/>
+    </w:rPr>
+  </w:style>
+  <w:style w:type="character" w:default="1" w:styleId="a0">
+    <w:name w:val="Default Paragraph Font"/>
+    <w:uiPriority w:val="1"/>
+    <w:semiHidden/>
+    <w:unhideWhenUsed/>
+  </w:style>
+  <w:style w:type="table" w:default="1" w:styleId="a1">
+    <w:name w:val="Normal Table"/>
+    <w:uiPriority w:val="99"/>
+    <w:semiHidden/>
+    <w:unhideWhenUsed/>
+    <w:tblPr>
+      <w:tblInd w:w="0" w:type="dxa"/>
+      <w:tblCellMar>
+        <w:top w:w="0" w:type="dxa"/>
+        <w:left w:w="108" w:type="dxa"/>
+        <w:bottom w:w="0" w:type="dxa"/>
+        <w:right w:w="108" w:type="dxa"/>
+      </w:tblCellMar>
+    </w:tblPr>
+  </w:style>
+  <w:style w:type="numbering" w:default="1" w:styleId="a2">
+    <w:name w:val="No List"/>
+    <w:uiPriority w:val="99"/>
+    <w:semiHidden/>
+    <w:unhideWhenUsed/>
+  </w:style>
+  <w:style w:type="paragraph" w:styleId="a3">
+    <w:name w:val="caption"/>
+    <w:basedOn w:val="a"/>
+    <w:next w:val="a"/>
+    <w:link w:val="Char"/>
+    <w:uiPriority w:val="35"/>
+    <w:unhideWhenUsed/>
+    <w:qFormat/>
+    <w:rPr>
+      <w:rFonts w:asciiTheme="majorHAnsi" w:eastAsia="黑体" w:hAnsiTheme="majorHAnsi" w:cstheme="majorBidi"/>
+      <w:sz w:val="20"/>
+      <w:szCs w:val="20"/>
+    </w:rPr>
+  </w:style>
+  <w:style w:type="paragraph" w:styleId="a4">
+    <w:name w:val="Document Map"/>
+    <w:basedOn w:val="a"/>
+    <w:link w:val="Char0"/>
+    <w:uiPriority w:val="99"/>
+    <w:semiHidden/>
+    <w:unhideWhenUsed/>
+    <w:qFormat/>
+    <w:rPr>
+      <w:rFonts w:ascii="宋体" w:eastAsia="宋体"/>
+      <w:sz w:val="18"/>
+      <w:szCs w:val="18"/>
+    </w:rPr>
+  </w:style>
+  <w:style w:type="paragraph" w:styleId="a5">
+    <w:name w:val="annotation text"/>
+    <w:basedOn w:val="a"/>
+    <w:link w:val="Char1"/>
+    <w:uiPriority w:val="99"/>
+    <w:unhideWhenUsed/>
+    <w:qFormat/>
+    <w:pPr>
+      <w:jc w:val="left"/>
+    </w:pPr>
+  </w:style>
+  <w:style w:type="paragraph" w:styleId="a6">
+    <w:name w:val="Body Text"/>
+    <w:basedOn w:val="a"/>
+    <w:link w:val="Char2"/>
+    <w:uiPriority w:val="99"/>
+    <w:unhideWhenUsed/>
+    <w:qFormat/>
+    <w:pPr>
+      <w:spacing w:after="120"/>
+    </w:pPr>
+  </w:style>
+  <w:style w:type="paragraph" w:styleId="30">
+    <w:name w:val="toc 3"/>
+    <w:basedOn w:val="a"/>
+    <w:next w:val="a"/>
+    <w:uiPriority w:val="39"/>
+    <w:semiHidden/>
+    <w:unhideWhenUsed/>
+    <w:qFormat/>
+    <w:pPr>
+      <w:ind w:leftChars="400" w:left="840"/>
+    </w:pPr>
+    <w:rPr>
+      <w:rFonts w:ascii="Times New Roman" w:hAnsi="Times New Roman"/>
+      <w:sz w:val="24"/>
+    </w:rPr>
+  </w:style>
+  <w:style w:type="paragraph" w:styleId="a7">
+    <w:name w:val="Date"/>
+    <w:basedOn w:val="a"/>
+    <w:next w:val="a"/>
+    <w:link w:val="Char3"/>
+    <w:uiPriority w:val="99"/>
+    <w:semiHidden/>
+    <w:unhideWhenUsed/>
+    <w:qFormat/>
+    <w:pPr>
+      <w:ind w:leftChars="2500" w:left="100"/>
+    </w:pPr>
+  </w:style>
+  <w:style w:type="paragraph" w:styleId="a8">
+    <w:name w:val="Balloon Text"/>
+    <w:basedOn w:val="a"/>
+    <w:link w:val="Char4"/>
+    <w:uiPriority w:val="99"/>
+    <w:semiHidden/>
+    <w:unhideWhenUsed/>
+    <w:qFormat/>
+    <w:rPr>
+      <w:sz w:val="18"/>
+      <w:szCs w:val="18"/>
+    </w:rPr>
+  </w:style>
+  <w:style w:type="paragraph" w:styleId="a9">
+    <w:name w:val="footer"/>
+    <w:basedOn w:val="a"/>
+    <w:link w:val="Char5"/>
+    <w:uiPriority w:val="99"/>
+    <w:unhideWhenUsed/>
+    <w:qFormat/>
+    <w:pPr>
+      <w:tabs>
+        <w:tab w:val="center" w:pos="4153"/>
+        <w:tab w:val="right" w:pos="8306"/>
+      </w:tabs>
+      <w:snapToGrid w:val="0"/>
+      <w:jc w:val="left"/>
+    </w:pPr>
+    <w:rPr>
+      <w:sz w:val="18"/>
+      <w:szCs w:val="18"/>
+    </w:rPr>
+  </w:style>
+  <w:style w:type="paragraph" w:styleId="aa">
+    <w:name w:val="header"/>
+    <w:basedOn w:val="a"/>
+    <w:link w:val="Char6"/>
+    <w:uiPriority w:val="99"/>
+    <w:unhideWhenUsed/>
+    <w:qFormat/>
+    <w:pPr>
+      <w:pBdr>
+        <w:bottom w:val="single" w:sz="6" w:space="1" w:color="auto"/>
+      </w:pBdr>
+      <w:tabs>
+        <w:tab w:val="center" w:pos="4153"/>
+        <w:tab w:val="right" w:pos="8306"/>
+      </w:tabs>
+      <w:snapToGrid w:val="0"/>
+      <w:jc w:val="center"/>
+    </w:pPr>
+    <w:rPr>
+      <w:sz w:val="18"/>
+      <w:szCs w:val="18"/>
+    </w:rPr>
+  </w:style>
+  <w:style w:type="paragraph" w:styleId="10">
+    <w:name w:val="toc 1"/>
+    <w:basedOn w:val="a"/>
+    <w:next w:val="a"/>
+    <w:uiPriority w:val="39"/>
+    <w:semiHidden/>
+    <w:unhideWhenUsed/>
+    <w:qFormat/>
+    <w:rPr>
+      <w:rFonts w:ascii="Times New Roman" w:hAnsi="Times New Roman"/>
+      <w:sz w:val="24"/>
+    </w:rPr>
+  </w:style>
+  <w:style w:type="paragraph" w:styleId="ab">
+    <w:name w:val="Subtitle"/>
+    <w:basedOn w:val="a"/>
+    <w:next w:val="a"/>
+    <w:link w:val="Char7"/>
+    <w:uiPriority w:val="11"/>
+    <w:qFormat/>
+    <w:pPr>
+      <w:spacing w:before="240" w:after="60" w:line="312" w:lineRule="auto"/>
+      <w:jc w:val="center"/>
+      <w:outlineLvl w:val="1"/>
+    </w:pPr>
+    <w:rPr>
+      <w:rFonts w:asciiTheme="majorHAnsi" w:eastAsia="宋体" w:hAnsiTheme="majorHAnsi" w:cstheme="majorBidi"/>
+      <w:b/>
+      <w:bCs/>
+      <w:kern w:val="28"/>
+      <w:sz w:val="32"/>
+      <w:szCs w:val="32"/>
+    </w:rPr>
+  </w:style>
+  <w:style w:type="paragraph" w:styleId="20">
+    <w:name w:val="toc 2"/>
+    <w:basedOn w:val="a"/>
+    <w:next w:val="a"/>
+    <w:uiPriority w:val="39"/>
+    <w:semiHidden/>
+    <w:unhideWhenUsed/>
+    <w:qFormat/>
+    <w:pPr>
+      <w:ind w:leftChars="200" w:left="420"/>
+    </w:pPr>
+    <w:rPr>
+      <w:rFonts w:ascii="Times New Roman" w:hAnsi="Times New Roman"/>
+      <w:sz w:val="24"/>
+    </w:rPr>
+  </w:style>
+  <w:style w:type="paragraph" w:styleId="ac">
+    <w:name w:val="Title"/>
+    <w:basedOn w:val="a"/>
+    <w:next w:val="a"/>
+    <w:link w:val="Char8"/>
+    <w:qFormat/>
+    <w:pPr>
+      <w:spacing w:before="240" w:after="60"/>
+      <w:jc w:val="center"/>
+      <w:outlineLvl w:val="0"/>
+    </w:pPr>
+    <w:rPr>
+      <w:rFonts w:asciiTheme="majorHAnsi" w:eastAsia="宋体" w:hAnsiTheme="majorHAnsi" w:cstheme="majorBidi"/>
+      <w:b/>
+      <w:bCs/>
+      <w:sz w:val="32"/>
+      <w:szCs w:val="32"/>
+    </w:rPr>
+  </w:style>
+  <w:style w:type="paragraph" w:styleId="ad">
+    <w:name w:val="annotation subject"/>
+    <w:basedOn w:val="a5"/>
+    <w:next w:val="a5"/>
+    <w:link w:val="Char9"/>
+    <w:uiPriority w:val="99"/>
+    <w:semiHidden/>
+    <w:unhideWhenUsed/>
+    <w:qFormat/>
+    <w:pPr>
+      <w:spacing w:line="360" w:lineRule="auto"/>
+      <w:ind w:firstLineChars="200" w:firstLine="200"/>
+    </w:pPr>
+    <w:rPr>
+      <w:rFonts w:ascii="Calibri" w:eastAsia="宋体" w:hAnsi="Calibri" w:cs="Times New Roman"/>
+      <w:b/>
+      <w:bCs/>
+      <w:sz w:val="24"/>
+    </w:rPr>
+  </w:style>
+  <w:style w:type="table" w:styleId="ae">
+    <w:name w:val="Table Grid"/>
+    <w:basedOn w:val="a1"/>
+    <w:uiPriority w:val="59"/>
+    <w:semiHidden/>
+    <w:unhideWhenUsed/>
+    <w:qFormat/>
+    <w:tblPr>
+      <w:tblInd w:w="0" w:type="dxa"/>
+      <w:tblBorders>
+        <w:top w:val="single" w:sz="4" w:space="0" w:color="auto"/>
+        <w:left w:val="single" w:sz="4" w:space="0" w:color="auto"/>
+        <w:bottom w:val="single" w:sz="4" w:space="0" w:color="auto"/>
+        <w:right w:val="single" w:sz="4" w:space="0" w:color="auto"/>
+        <w:insideH w:val="single" w:sz="4" w:space="0" w:color="auto"/>
+        <w:insideV w:val="single" w:sz="4" w:space="0" w:color="auto"/>
+      </w:tblBorders>
+      <w:tblCellMar>
+        <w:top w:w="0" w:type="dxa"/>
+        <w:left w:w="108" w:type="dxa"/>
+        <w:bottom w:w="0" w:type="dxa"/>
+        <w:right w:w="108" w:type="dxa"/>
+      </w:tblCellMar>
+    </w:tblPr>
+  </w:style>
+  <w:style w:type="character" w:styleId="af">
+    <w:name w:val="annotation reference"/>
+    <w:basedOn w:val="a0"/>
+    <w:unhideWhenUsed/>
+    <w:qFormat/>
+    <w:rPr>
+      <w:sz w:val="21"/>
+      <w:szCs w:val="21"/>
+    </w:rPr>
+  </w:style>
+  <w:style w:type="paragraph" w:customStyle="1" w:styleId="RCTABLE">
+    <w:name w:val="RCTABLE"/>
+    <w:basedOn w:val="a"/>
+    <w:link w:val="RCTABLEChar"/>
+    <w:uiPriority w:val="99"/>
+    <w:qFormat/>
+    <w:rPr>
+      <w:kern w:val="0"/>
+      <w:szCs w:val="20"/>
+    </w:rPr>
+  </w:style>
+  <w:style w:type="character" w:customStyle="1" w:styleId="RCTABLEChar">
+    <w:name w:val="RCTABLE Char"/>
+    <w:link w:val="RCTABLE"/>
+    <w:uiPriority w:val="99"/>
+    <w:qFormat/>
+    <w:locked/>
+    <w:rPr>
+      <w:rFonts w:ascii="Calibri" w:eastAsia="宋体" w:hAnsi="Calibri" w:cs="Times New Roman"/>
+      <w:kern w:val="0"/>
+      <w:szCs w:val="20"/>
+    </w:rPr>
+  </w:style>
+  <w:style w:type="character" w:customStyle="1" w:styleId="2Char">
+    <w:name w:val="标题 2 Char"/>
+    <w:basedOn w:val="a0"/>
+    <w:link w:val="2"/>
+    <w:uiPriority w:val="9"/>
+    <w:qFormat/>
+    <w:rPr>
+      <w:rFonts w:ascii="Times New Roman" w:eastAsiaTheme="majorEastAsia" w:hAnsi="Times New Roman" w:cstheme="majorBidi"/>
+      <w:b/>
+      <w:bCs/>
+      <w:sz w:val="24"/>
+      <w:szCs w:val="32"/>
+    </w:rPr>
+  </w:style>
+  <w:style w:type="character" w:customStyle="1" w:styleId="6Char">
+    <w:name w:val="标题 6 Char"/>
+    <w:basedOn w:val="a0"/>
+    <w:link w:val="6"/>
+    <w:uiPriority w:val="9"/>
+    <w:qFormat/>
+    <w:rPr>
+      <w:rFonts w:ascii="Times New Roman" w:eastAsiaTheme="majorEastAsia" w:hAnsi="Times New Roman" w:cstheme="majorBidi"/>
+      <w:b/>
+      <w:bCs/>
+      <w:sz w:val="24"/>
+      <w:szCs w:val="24"/>
+    </w:rPr>
+  </w:style>
+  <w:style w:type="character" w:customStyle="1" w:styleId="Char6">
+    <w:name w:val="页眉 Char"/>
+    <w:basedOn w:val="a0"/>
+    <w:link w:val="aa"/>
+    <w:uiPriority w:val="99"/>
+    <w:qFormat/>
+    <w:rPr>
+      <w:rFonts w:ascii="Calibri" w:eastAsia="宋体" w:hAnsi="Calibri" w:cs="Times New Roman"/>
+      <w:sz w:val="18"/>
+      <w:szCs w:val="18"/>
+    </w:rPr>
+  </w:style>
+  <w:style w:type="character" w:customStyle="1" w:styleId="Char5">
+    <w:name w:val="页脚 Char"/>
+    <w:basedOn w:val="a0"/>
+    <w:link w:val="a9"/>
+    <w:uiPriority w:val="99"/>
+    <w:qFormat/>
+    <w:rPr>
+      <w:rFonts w:ascii="Calibri" w:eastAsia="宋体" w:hAnsi="Calibri" w:cs="Times New Roman"/>
+      <w:sz w:val="18"/>
+      <w:szCs w:val="18"/>
+    </w:rPr>
+  </w:style>
+  <w:style w:type="paragraph" w:customStyle="1" w:styleId="af0">
+    <w:name w:val="样式 四号 加粗 居中"/>
+    <w:basedOn w:val="a6"/>
+    <w:next w:val="a6"/>
+    <w:qFormat/>
+    <w:pPr>
+      <w:spacing w:after="0"/>
+      <w:jc w:val="center"/>
+    </w:pPr>
+    <w:rPr>
+      <w:rFonts w:ascii="Times New Roman" w:hAnsi="Times New Roman" w:cs="宋体"/>
+      <w:b/>
+      <w:bCs/>
+      <w:sz w:val="28"/>
+      <w:szCs w:val="20"/>
+    </w:rPr>
+  </w:style>
+  <w:style w:type="character" w:customStyle="1" w:styleId="Char2">
+    <w:name w:val="正文文本 Char"/>
+    <w:basedOn w:val="a0"/>
+    <w:link w:val="a6"/>
+    <w:uiPriority w:val="99"/>
+    <w:qFormat/>
+    <w:rPr>
+      <w:rFonts w:ascii="Calibri" w:eastAsia="宋体" w:hAnsi="Calibri" w:cs="Times New Roman"/>
+      <w:sz w:val="24"/>
+    </w:rPr>
+  </w:style>
+  <w:style w:type="character" w:customStyle="1" w:styleId="Char">
+    <w:name w:val="题注 Char"/>
+    <w:basedOn w:val="a0"/>
+    <w:link w:val="a3"/>
+    <w:uiPriority w:val="35"/>
+    <w:qFormat/>
+    <w:rPr>
+      <w:rFonts w:asciiTheme="majorHAnsi" w:eastAsia="黑体" w:hAnsiTheme="majorHAnsi" w:cstheme="majorBidi"/>
+      <w:sz w:val="20"/>
+      <w:szCs w:val="20"/>
+    </w:rPr>
+  </w:style>
+  <w:style w:type="paragraph" w:customStyle="1" w:styleId="RC2">
+    <w:name w:val="RC2"/>
+    <w:basedOn w:val="a"/>
+    <w:link w:val="RC2Char"/>
+    <w:qFormat/>
+    <w:pPr>
+      <w:ind w:firstLine="482"/>
+    </w:pPr>
+    <w:rPr>
+      <w:rFonts w:ascii="宋体" w:hAnsi="宋体"/>
+      <w:b/>
+      <w:i/>
+      <w:color w:val="548DD4"/>
+      <w:kern w:val="0"/>
+      <w:szCs w:val="24"/>
+    </w:rPr>
+  </w:style>
+  <w:style w:type="character" w:customStyle="1" w:styleId="RC2Char">
+    <w:name w:val="RC2 Char"/>
+    <w:link w:val="RC2"/>
+    <w:qFormat/>
+    <w:rPr>
+      <w:rFonts w:ascii="宋体" w:eastAsia="宋体" w:hAnsi="宋体" w:cs="Times New Roman"/>
+      <w:b/>
+      <w:i/>
+      <w:color w:val="548DD4"/>
+      <w:kern w:val="0"/>
+      <w:sz w:val="24"/>
+      <w:szCs w:val="24"/>
+    </w:rPr>
+  </w:style>
+  <w:style w:type="character" w:customStyle="1" w:styleId="Char1">
+    <w:name w:val="批注文字 Char"/>
     <w:basedOn w:val="a0"/>
     <w:link w:val="a5"/>
     <w:uiPriority w:val="99"/>
+    <w:qFormat/>
+  </w:style>
+  <w:style w:type="character" w:customStyle="1" w:styleId="Char4">
+    <w:name w:val="批注框文本 Char"/>
+    <w:basedOn w:val="a0"/>
+    <w:link w:val="a8"/>
+    <w:uiPriority w:val="99"/>
+    <w:semiHidden/>
+    <w:qFormat/>
+    <w:rPr>
+      <w:rFonts w:ascii="Calibri" w:eastAsia="宋体" w:hAnsi="Calibri" w:cs="Times New Roman"/>
+      <w:sz w:val="18"/>
+      <w:szCs w:val="18"/>
+    </w:rPr>
+  </w:style>
+  <w:style w:type="character" w:customStyle="1" w:styleId="Char9">
+    <w:name w:val="批注主题 Char"/>
+    <w:basedOn w:val="Char1"/>
+    <w:link w:val="ad"/>
+    <w:uiPriority w:val="99"/>
+    <w:semiHidden/>
+    <w:qFormat/>
+    <w:rPr>
+      <w:rFonts w:ascii="Calibri" w:eastAsia="宋体" w:hAnsi="Calibri" w:cs="Times New Roman"/>
+      <w:b/>
+      <w:bCs/>
+      <w:sz w:val="24"/>
+    </w:rPr>
+  </w:style>
+  <w:style w:type="paragraph" w:customStyle="1" w:styleId="RC">
+    <w:name w:val="RC正文"/>
+    <w:basedOn w:val="a"/>
+    <w:link w:val="RCChar"/>
+    <w:qFormat/>
+    <w:pPr>
+      <w:spacing w:line="360" w:lineRule="auto"/>
+      <w:ind w:firstLineChars="200" w:firstLine="480"/>
+    </w:pPr>
+    <w:rPr>
+      <w:rFonts w:ascii="Times New Roman" w:hAnsi="Times New Roman"/>
+      <w:sz w:val="24"/>
+    </w:rPr>
+  </w:style>
+  <w:style w:type="character" w:customStyle="1" w:styleId="RCChar">
+    <w:name w:val="RC正文 Char"/>
+    <w:basedOn w:val="a0"/>
+    <w:link w:val="RC"/>
+    <w:qFormat/>
+    <w:rPr>
+      <w:rFonts w:ascii="Times New Roman" w:hAnsi="Times New Roman"/>
+      <w:sz w:val="24"/>
+    </w:rPr>
+  </w:style>
+  <w:style w:type="paragraph" w:customStyle="1" w:styleId="RC0">
+    <w:name w:val="RC标题"/>
+    <w:basedOn w:val="ac"/>
+    <w:link w:val="RCChar0"/>
+    <w:qFormat/>
+    <w:pPr>
+      <w:outlineLvl w:val="9"/>
+    </w:pPr>
+    <w:rPr>
+      <w:rFonts w:ascii="黑体" w:eastAsia="黑体" w:hAnsi="黑体"/>
+      <w:sz w:val="44"/>
+    </w:rPr>
+  </w:style>
+  <w:style w:type="character" w:customStyle="1" w:styleId="RCChar0">
+    <w:name w:val="RC标题 Char"/>
+    <w:basedOn w:val="Char8"/>
+    <w:link w:val="RC0"/>
+    <w:qFormat/>
+    <w:rPr>
+      <w:rFonts w:ascii="黑体" w:eastAsia="黑体" w:hAnsi="黑体" w:cstheme="majorBidi"/>
+      <w:b/>
+      <w:bCs/>
+      <w:sz w:val="44"/>
+      <w:szCs w:val="32"/>
+    </w:rPr>
+  </w:style>
+  <w:style w:type="character" w:customStyle="1" w:styleId="Char8">
+    <w:name w:val="标题 Char"/>
+    <w:basedOn w:val="a0"/>
+    <w:link w:val="ac"/>
+    <w:qFormat/>
+    <w:rPr>
+      <w:rFonts w:asciiTheme="majorHAnsi" w:eastAsia="宋体" w:hAnsiTheme="majorHAnsi" w:cstheme="majorBidi"/>
+      <w:b/>
+      <w:bCs/>
+      <w:sz w:val="32"/>
+      <w:szCs w:val="32"/>
+    </w:rPr>
+  </w:style>
+  <w:style w:type="paragraph" w:customStyle="1" w:styleId="RC1">
+    <w:name w:val="RC题注"/>
+    <w:basedOn w:val="a3"/>
+    <w:link w:val="RCChar1"/>
+    <w:qFormat/>
+    <w:pPr>
+      <w:spacing w:line="300" w:lineRule="auto"/>
+      <w:jc w:val="center"/>
+    </w:pPr>
+    <w:rPr>
+      <w:rFonts w:ascii="Times New Roman" w:hAnsi="Times New Roman"/>
+      <w:sz w:val="21"/>
+      <w:szCs w:val="21"/>
+    </w:rPr>
+  </w:style>
+  <w:style w:type="character" w:customStyle="1" w:styleId="RCChar1">
+    <w:name w:val="RC题注 Char"/>
+    <w:basedOn w:val="Char"/>
+    <w:link w:val="RC1"/>
+    <w:qFormat/>
+    <w:rPr>
+      <w:rFonts w:ascii="Times New Roman" w:eastAsia="黑体" w:hAnsi="Times New Roman" w:cstheme="majorBidi"/>
+      <w:sz w:val="20"/>
+      <w:szCs w:val="21"/>
+    </w:rPr>
+  </w:style>
+  <w:style w:type="character" w:customStyle="1" w:styleId="1Char">
+    <w:name w:val="标题 1 Char"/>
+    <w:basedOn w:val="a0"/>
+    <w:link w:val="1"/>
+    <w:uiPriority w:val="9"/>
+    <w:qFormat/>
+    <w:rPr>
+      <w:rFonts w:ascii="Times New Roman" w:eastAsiaTheme="majorEastAsia" w:hAnsi="Times New Roman"/>
+      <w:b/>
+      <w:bCs/>
+      <w:kern w:val="44"/>
+      <w:sz w:val="28"/>
+      <w:szCs w:val="44"/>
+    </w:rPr>
+  </w:style>
+  <w:style w:type="character" w:customStyle="1" w:styleId="3Char">
+    <w:name w:val="标题 3 Char"/>
+    <w:basedOn w:val="a0"/>
+    <w:link w:val="3"/>
+    <w:uiPriority w:val="9"/>
+    <w:semiHidden/>
+    <w:qFormat/>
+    <w:rPr>
+      <w:rFonts w:ascii="Times New Roman" w:hAnsi="Times New Roman"/>
+      <w:b/>
+      <w:bCs/>
+      <w:sz w:val="24"/>
+      <w:szCs w:val="32"/>
+    </w:rPr>
+  </w:style>
+  <w:style w:type="character" w:customStyle="1" w:styleId="4Char">
+    <w:name w:val="标题 4 Char"/>
+    <w:basedOn w:val="a0"/>
+    <w:link w:val="4"/>
+    <w:uiPriority w:val="9"/>
+    <w:semiHidden/>
+    <w:qFormat/>
+    <w:rPr>
+      <w:rFonts w:ascii="Times New Roman" w:eastAsiaTheme="majorEastAsia" w:hAnsi="Times New Roman" w:cstheme="majorBidi"/>
+      <w:b/>
+      <w:bCs/>
+      <w:sz w:val="24"/>
+      <w:szCs w:val="28"/>
+    </w:rPr>
+  </w:style>
+  <w:style w:type="character" w:customStyle="1" w:styleId="5Char">
+    <w:name w:val="标题 5 Char"/>
+    <w:basedOn w:val="a0"/>
+    <w:link w:val="5"/>
+    <w:uiPriority w:val="9"/>
+    <w:semiHidden/>
+    <w:qFormat/>
+    <w:rPr>
+      <w:rFonts w:ascii="Times New Roman" w:hAnsi="Times New Roman"/>
+      <w:b/>
+      <w:bCs/>
+      <w:sz w:val="24"/>
+      <w:szCs w:val="28"/>
+    </w:rPr>
+  </w:style>
+  <w:style w:type="character" w:customStyle="1" w:styleId="7Char">
+    <w:name w:val="标题 7 Char"/>
+    <w:basedOn w:val="a0"/>
+    <w:link w:val="7"/>
+    <w:uiPriority w:val="9"/>
+    <w:semiHidden/>
+    <w:qFormat/>
+    <w:rPr>
+      <w:b/>
+      <w:bCs/>
+      <w:sz w:val="24"/>
+      <w:szCs w:val="24"/>
+    </w:rPr>
+  </w:style>
+  <w:style w:type="character" w:customStyle="1" w:styleId="8Char">
+    <w:name w:val="标题 8 Char"/>
+    <w:basedOn w:val="a0"/>
+    <w:link w:val="8"/>
+    <w:uiPriority w:val="9"/>
+    <w:semiHidden/>
+    <w:qFormat/>
+    <w:rPr>
+      <w:rFonts w:asciiTheme="majorHAnsi" w:eastAsiaTheme="majorEastAsia" w:hAnsiTheme="majorHAnsi" w:cstheme="majorBidi"/>
+      <w:sz w:val="24"/>
+      <w:szCs w:val="24"/>
+    </w:rPr>
+  </w:style>
+  <w:style w:type="character" w:customStyle="1" w:styleId="9Char">
+    <w:name w:val="标题 9 Char"/>
+    <w:basedOn w:val="a0"/>
+    <w:link w:val="9"/>
+    <w:uiPriority w:val="9"/>
+    <w:semiHidden/>
+    <w:qFormat/>
+    <w:rPr>
+      <w:rFonts w:asciiTheme="majorHAnsi" w:eastAsiaTheme="majorEastAsia" w:hAnsiTheme="majorHAnsi" w:cstheme="majorBidi"/>
+      <w:szCs w:val="21"/>
+    </w:rPr>
+  </w:style>
+  <w:style w:type="character" w:customStyle="1" w:styleId="Char7">
+    <w:name w:val="副标题 Char"/>
+    <w:basedOn w:val="a0"/>
+    <w:link w:val="ab"/>
+    <w:uiPriority w:val="11"/>
+    <w:qFormat/>
+    <w:rPr>
+      <w:rFonts w:asciiTheme="majorHAnsi" w:eastAsia="宋体" w:hAnsiTheme="majorHAnsi" w:cstheme="majorBidi"/>
+      <w:b/>
+      <w:bCs/>
+      <w:kern w:val="28"/>
+      <w:sz w:val="32"/>
+      <w:szCs w:val="32"/>
+    </w:rPr>
+  </w:style>
+  <w:style w:type="paragraph" w:styleId="af1">
+    <w:name w:val="List Paragraph"/>
+    <w:basedOn w:val="a"/>
+    <w:uiPriority w:val="34"/>
+    <w:qFormat/>
+    <w:pPr>
+      <w:ind w:firstLineChars="200" w:firstLine="420"/>
+    </w:pPr>
+  </w:style>
+  <w:style w:type="paragraph" w:customStyle="1" w:styleId="TOC1">
+    <w:name w:val="TOC 标题1"/>
+    <w:basedOn w:val="1"/>
+    <w:next w:val="a"/>
+    <w:uiPriority w:val="39"/>
+    <w:semiHidden/>
+    <w:unhideWhenUsed/>
+    <w:qFormat/>
+    <w:pPr>
+      <w:widowControl/>
+      <w:spacing w:before="480" w:line="276" w:lineRule="auto"/>
+      <w:jc w:val="left"/>
+      <w:outlineLvl w:val="9"/>
+    </w:pPr>
+    <w:rPr>
+      <w:rFonts w:asciiTheme="majorHAnsi" w:hAnsiTheme="majorHAnsi" w:cstheme="majorBidi"/>
+      <w:color w:val="365F91" w:themeColor="accent1" w:themeShade="BF"/>
+      <w:kern w:val="0"/>
+      <w:szCs w:val="28"/>
+    </w:rPr>
+  </w:style>
+  <w:style w:type="table" w:customStyle="1" w:styleId="RC3">
+    <w:name w:val="RC表格样式"/>
+    <w:basedOn w:val="a1"/>
+    <w:uiPriority w:val="99"/>
+    <w:qFormat/>
+    <w:pPr>
+      <w:spacing w:line="300" w:lineRule="auto"/>
+      <w:jc w:val="center"/>
+    </w:pPr>
+    <w:tblPr>
+      <w:tblInd w:w="0" w:type="dxa"/>
+      <w:tblBorders>
+        <w:top w:val="single" w:sz="12" w:space="0" w:color="auto"/>
+        <w:left w:val="single" w:sz="12" w:space="0" w:color="auto"/>
+        <w:bottom w:val="single" w:sz="12" w:space="0" w:color="auto"/>
+        <w:right w:val="single" w:sz="12" w:space="0" w:color="auto"/>
+        <w:insideH w:val="single" w:sz="4" w:space="0" w:color="auto"/>
+        <w:insideV w:val="single" w:sz="4" w:space="0" w:color="auto"/>
+      </w:tblBorders>
+      <w:tblCellMar>
+        <w:top w:w="0" w:type="dxa"/>
+        <w:left w:w="108" w:type="dxa"/>
+        <w:bottom w:w="0" w:type="dxa"/>
+        <w:right w:w="108" w:type="dxa"/>
+      </w:tblCellMar>
+    </w:tblPr>
+    <w:tcPr>
+      <w:vAlign w:val="center"/>
+    </w:tcPr>
+  </w:style>
+  <w:style w:type="character" w:customStyle="1" w:styleId="Char3">
+    <w:name w:val="日期 Char"/>
+    <w:basedOn w:val="a0"/>
+    <w:link w:val="a7"/>
+    <w:uiPriority w:val="99"/>
+    <w:semiHidden/>
+    <w:qFormat/>
+  </w:style>
+  <w:style w:type="character" w:customStyle="1" w:styleId="Char0">
+    <w:name w:val="文档结构图 Char"/>
+    <w:basedOn w:val="a0"/>
+    <w:link w:val="a4"/>
+    <w:uiPriority w:val="99"/>
     <w:semiHidden/>
     <w:qFormat/>
     <w:rPr>
@@ -7224,7 +8153,7 @@
       <w:szCs w:val="18"/>
     </w:rPr>
   </w:style>
-  <w:style w:type="paragraph" w:styleId="afd">
+  <w:style w:type="paragraph" w:styleId="af2">
     <w:name w:val="No Spacing"/>
     <w:uiPriority w:val="1"/>
     <w:qFormat/>
@@ -7560,7 +8489,7 @@
 </file>
 
 <file path=customXml/itemProps2.xml><?xml version="1.0" encoding="utf-8"?>
-<ds:datastoreItem xmlns:ds="http://schemas.openxmlformats.org/officeDocument/2006/customXml" ds:itemID="{45EB24DB-023D-4071-9604-23F156BDE703}">
+<ds:datastoreItem xmlns:ds="http://schemas.openxmlformats.org/officeDocument/2006/customXml" ds:itemID="{CB151013-E523-4667-AF31-E1B12F55495C}">
   <ds:schemaRefs>
     <ds:schemaRef ds:uri="http://schemas.openxmlformats.org/officeDocument/2006/bibliography"/>
   </ds:schemaRefs>

</xml_diff>